<commit_message>
docs: atualiza documentos da entrega
</commit_message>
<xml_diff>
--- a/docs/documentacao-login-seguro-M1.docx
+++ b/docs/documentacao-login-seguro-M1.docx
@@ -190,39 +190,7 @@
         <w:jc w:val="both"/>
       </w:pPr>
       <w:r>
-        <w:t xml:space="preserve">Este trabalho documenta o Sistema de Login Seguro, que desenvolvi individualmente como atividade para a nota M1 da disciplina de Aplicativos Web, no Bacharelado em Sistemas de Informação da Universidade de Mogi das Cruzes. A aplicação foi feita com Java 21, Spring Boot 4.1.1, Spring Security, </w:t>
-      </w:r>
-      <w:proofErr w:type="spellStart"/>
-      <w:r>
-        <w:t>Thymeleaf</w:t>
-      </w:r>
-      <w:proofErr w:type="spellEnd"/>
-      <w:r>
-        <w:t xml:space="preserve"> e </w:t>
-      </w:r>
-      <w:proofErr w:type="spellStart"/>
-      <w:r>
-        <w:t>MongoDB</w:t>
-      </w:r>
-      <w:proofErr w:type="spellEnd"/>
-      <w:r>
-        <w:t xml:space="preserve"> Atlas. Ela permite cadastrar usuários, entrar e sair do sistema e controla o acesso às páginas por três perfis: USER, MANAGER e ADMIN. As senhas são guardadas como </w:t>
-      </w:r>
-      <w:proofErr w:type="spellStart"/>
-      <w:r>
-        <w:t>hash</w:t>
-      </w:r>
-      <w:proofErr w:type="spellEnd"/>
-      <w:r>
-        <w:t xml:space="preserve"> </w:t>
-      </w:r>
-      <w:proofErr w:type="spellStart"/>
-      <w:r>
-        <w:t>BCrypt</w:t>
-      </w:r>
-      <w:proofErr w:type="spellEnd"/>
-      <w:r>
-        <w:t>, os dados passam por validação no servidor e as sessões ficam salvas no Atlas, junto com os usuários. O administrador consegue listar, editar e excluir contas. O documento explica a organização do código em camadas, a integração com o banco e o caminho para adaptar o sistema ao Projeto Final de Curso trocando o nome, o tema e os fragmentos da interface. Também registra os requisitos e as regras de negócio com a situação real de cada um e as limitações desta versão.</w:t>
+        <w:t>Este trabalho documenta o Sistema de Login Seguro, que desenvolvi individualmente como atividade para a nota M1 da disciplina de Aplicativos Web, no Bacharelado em Sistemas de Informação da Universidade de Mogi das Cruzes. A aplicação foi feita com Java 21, Spring Boot 4.1.1, Spring Security, Thymeleaf e MongoDB Atlas. Ela permite cadastrar usuários, entrar e sair do sistema e controla o acesso às páginas por três perfis: USER, MANAGER e ADMIN. As senhas são guardadas como hash BCrypt, os dados passam por validação no servidor e as sessões ficam salvas no Atlas, junto com os usuários. O administrador consegue listar, editar e excluir contas. O documento explica a organização do código em camadas, a integração com o banco e o caminho para adaptar o sistema ao Projeto Final de Curso trocando o nome, o tema e os fragmentos da interface. Também registra os requisitos e as regras de negócio com a situação real de cada um e as limitações desta versão.</w:t>
       </w:r>
     </w:p>
     <w:p/>
@@ -238,23 +206,7 @@
         <w:t xml:space="preserve">Palavras-chave: </w:t>
       </w:r>
       <w:r>
-        <w:t xml:space="preserve">autenticação; autorização; Spring Security; </w:t>
-      </w:r>
-      <w:proofErr w:type="spellStart"/>
-      <w:r>
-        <w:t>MongoDB</w:t>
-      </w:r>
-      <w:proofErr w:type="spellEnd"/>
-      <w:r>
-        <w:t xml:space="preserve"> Atlas; </w:t>
-      </w:r>
-      <w:proofErr w:type="spellStart"/>
-      <w:r>
-        <w:t>Thymeleaf</w:t>
-      </w:r>
-      <w:proofErr w:type="spellEnd"/>
-      <w:r>
-        <w:t>.</w:t>
+        <w:t>autenticação; autorização; Spring Security; MongoDB Atlas; Thymeleaf.</w:t>
       </w:r>
     </w:p>
     <w:p>
@@ -281,6 +233,7 @@
         <w:alias w:val="Sumário"/>
         <w:id w:val="490455299"/>
       </w:sdtPr>
+      <w:sdtEndPr/>
       <w:sdtContent>
         <w:p>
           <w:pPr>
@@ -1941,23 +1894,7 @@
         <w:jc w:val="both"/>
       </w:pPr>
       <w:r>
-        <w:t xml:space="preserve">A proposta da atividade M1 foi construir, individualmente, um sistema de login seguro com Java Spring Boot, </w:t>
-      </w:r>
-      <w:proofErr w:type="spellStart"/>
-      <w:r>
-        <w:t>Thymeleaf</w:t>
-      </w:r>
-      <w:proofErr w:type="spellEnd"/>
-      <w:r>
-        <w:t xml:space="preserve"> e </w:t>
-      </w:r>
-      <w:proofErr w:type="spellStart"/>
-      <w:r>
-        <w:t>MongoDB</w:t>
-      </w:r>
-      <w:proofErr w:type="spellEnd"/>
-      <w:r>
-        <w:t xml:space="preserve"> Atlas, capaz de controlar os usuários de uma aplicação web com autenticação e autorização. Além de funcionar, o sistema precisava servir de base para o Projeto Final de Curso (PFC). Por isso, desde o começo procurei separar a parte de segurança da parte visual, para que a aparência e as funcionalidades possam mudar sem reescrever o núcleo.</w:t>
+        <w:t>A proposta da atividade M1 foi construir, individualmente, um sistema de login seguro com Java Spring Boot, Thymeleaf e MongoDB Atlas, capaz de controlar os usuários de uma aplicação web com autenticação e autorização. Além de funcionar, o sistema precisava servir de base para o Projeto Final de Curso (PFC). Por isso, desde o começo procurei separar a parte de segurança da parte visual, para que a aparência e as funcionalidades possam mudar sem reescrever o núcleo.</w:t>
       </w:r>
     </w:p>
     <w:p>
@@ -1966,39 +1903,7 @@
         <w:jc w:val="both"/>
       </w:pPr>
       <w:r>
-        <w:t xml:space="preserve">No meu projeto, o código está no GitHub, no repositório login-seguro, e foi desenvolvido com o fluxo </w:t>
-      </w:r>
-      <w:proofErr w:type="spellStart"/>
-      <w:r>
-        <w:t>GitFlow</w:t>
-      </w:r>
-      <w:proofErr w:type="spellEnd"/>
-      <w:r>
-        <w:t xml:space="preserve">: cada funcionalidade nasceu em uma </w:t>
-      </w:r>
-      <w:proofErr w:type="spellStart"/>
-      <w:r>
-        <w:t>branch</w:t>
-      </w:r>
-      <w:proofErr w:type="spellEnd"/>
-      <w:r>
-        <w:t xml:space="preserve"> feature, como feature/cadastro, feature/login e feature/</w:t>
-      </w:r>
-      <w:proofErr w:type="spellStart"/>
-      <w:r>
-        <w:t>sessoes-mongodb</w:t>
-      </w:r>
-      <w:proofErr w:type="spellEnd"/>
-      <w:r>
-        <w:t xml:space="preserve">, e depois foi integrada à </w:t>
-      </w:r>
-      <w:proofErr w:type="spellStart"/>
-      <w:r>
-        <w:t>develop</w:t>
-      </w:r>
-      <w:proofErr w:type="spellEnd"/>
-      <w:r>
-        <w:t>.</w:t>
+        <w:t>No meu projeto, o código está no GitHub, no repositório login-seguro, e foi desenvolvido com o fluxo GitFlow: cada funcionalidade nasceu em uma branch feature, como feature/cadastro, feature/login e feature/sessoes-mongodb, e depois foi integrada à develop.</w:t>
       </w:r>
     </w:p>
     <w:p>
@@ -2017,23 +1922,7 @@
         <w:jc w:val="both"/>
       </w:pPr>
       <w:r>
-        <w:t xml:space="preserve">Este documento explica como o sistema foi implementado: a organização do código, a integração com o </w:t>
-      </w:r>
-      <w:proofErr w:type="spellStart"/>
-      <w:r>
-        <w:t>MongoDB</w:t>
-      </w:r>
-      <w:proofErr w:type="spellEnd"/>
-      <w:r>
-        <w:t xml:space="preserve"> Atlas e a forma de adaptar o projeto. Ele também registra os requisitos funcionais, os requisitos não funcionais e as regras de negócio com a situação de cada um no código entregue. Segundo </w:t>
-      </w:r>
-      <w:proofErr w:type="spellStart"/>
-      <w:r>
-        <w:t>Sommerville</w:t>
-      </w:r>
-      <w:proofErr w:type="spellEnd"/>
-      <w:r>
-        <w:t xml:space="preserve"> (2011, p. 63), o documento de requisitos deve comunicar as necessidades do sistema aos interessados e dar informações precisas a quem desenvolve e testa.</w:t>
+        <w:t>Este documento explica como o sistema foi implementado: a organização do código, a integração com o MongoDB Atlas e a forma de adaptar o projeto. Ele também registra os requisitos funcionais, os requisitos não funcionais e as regras de negócio com a situação de cada um no código entregue. Segundo Sommerville (2011, p. 63), o documento de requisitos deve comunicar as necessidades do sistema aos interessados e dar informações precisas a quem desenvolve e testa.</w:t>
       </w:r>
     </w:p>
     <w:p>
@@ -2081,15 +1970,7 @@
         <w:jc w:val="both"/>
       </w:pPr>
       <w:r>
-        <w:t xml:space="preserve">Os requisitos funcionais começam com “O sistema deverá” e usam verbos que dá para verificar, como cadastrar, autenticar, encerrar, listar, editar e excluir, seguindo o guia de apoio que usamos em aula (Silva, 2026). Esse cuidado segue a recomendação de </w:t>
-      </w:r>
-      <w:proofErr w:type="spellStart"/>
-      <w:r>
-        <w:t>Sommerville</w:t>
-      </w:r>
-      <w:proofErr w:type="spellEnd"/>
-      <w:r>
-        <w:t xml:space="preserve"> (2011, p. 67-68) de padronizar a forma de escrever os requisitos. A seção 5 apresenta os requisitos e as regras de negócio, e o quadro 1 explica os identificadores e as situações usadas.</w:t>
+        <w:t>Os requisitos funcionais começam com “O sistema deverá” e usam verbos que dá para verificar, como cadastrar, autenticar, encerrar, listar, editar e excluir, seguindo o guia de apoio que usamos em aula (Silva, 2026). Esse cuidado segue a recomendação de Sommerville (2011, p. 67-68) de padronizar a forma de escrever os requisitos. A seção 5 apresenta os requisitos e as regras de negócio, e o quadro 1 explica os identificadores e as situações usadas.</w:t>
       </w:r>
     </w:p>
     <w:p>
@@ -2560,15 +2441,7 @@
         <w:jc w:val="both"/>
       </w:pPr>
       <w:r>
-        <w:t xml:space="preserve">Como aprendemos em aula, dividir o código em camadas deixa cada classe com uma responsabilidade e facilita a manutenção. No meu projeto, todo o código Java fica no pacote </w:t>
-      </w:r>
-      <w:proofErr w:type="spellStart"/>
-      <w:r>
-        <w:t>br.com.felipe.login_seguro</w:t>
-      </w:r>
-      <w:proofErr w:type="spellEnd"/>
-      <w:r>
-        <w:t>, organizado conforme o quadro 2.</w:t>
+        <w:t>Como aprendemos em aula, dividir o código em camadas deixa cada classe com uma responsabilidade e facilita a manutenção. No meu projeto, todo o código Java fica no pacote br.com.felipe.login_seguro, organizado conforme o quadro 2.</w:t>
       </w:r>
     </w:p>
     <w:p>
@@ -2726,7 +2599,6 @@
               <w:keepLines/>
               <w:spacing w:after="40" w:line="240" w:lineRule="auto"/>
             </w:pPr>
-            <w:proofErr w:type="spellStart"/>
             <w:r>
               <w:rPr>
                 <w:b/>
@@ -2736,7 +2608,6 @@
               </w:rPr>
               <w:t>config</w:t>
             </w:r>
-            <w:proofErr w:type="spellEnd"/>
           </w:p>
         </w:tc>
         <w:tc>
@@ -2780,63 +2651,13 @@
               <w:keepLines/>
               <w:spacing w:after="40" w:line="240" w:lineRule="auto"/>
             </w:pPr>
-            <w:proofErr w:type="spellStart"/>
-            <w:r>
-              <w:rPr>
-                <w:sz w:val="20"/>
-                <w:szCs w:val="20"/>
-              </w:rPr>
-              <w:t>SecurityConfig</w:t>
-            </w:r>
-            <w:proofErr w:type="spellEnd"/>
-            <w:r>
-              <w:rPr>
-                <w:sz w:val="20"/>
-                <w:szCs w:val="20"/>
-              </w:rPr>
-              <w:t xml:space="preserve">, </w:t>
-            </w:r>
-            <w:proofErr w:type="spellStart"/>
-            <w:r>
-              <w:rPr>
-                <w:sz w:val="20"/>
-                <w:szCs w:val="20"/>
-              </w:rPr>
-              <w:t>SenhaConfig</w:t>
-            </w:r>
-            <w:proofErr w:type="spellEnd"/>
-            <w:r>
-              <w:rPr>
-                <w:sz w:val="20"/>
-                <w:szCs w:val="20"/>
-              </w:rPr>
-              <w:t xml:space="preserve">, </w:t>
-            </w:r>
-            <w:proofErr w:type="spellStart"/>
-            <w:r>
-              <w:rPr>
-                <w:sz w:val="20"/>
-                <w:szCs w:val="20"/>
-              </w:rPr>
-              <w:t>SessaoConfig</w:t>
-            </w:r>
-            <w:proofErr w:type="spellEnd"/>
-            <w:r>
-              <w:rPr>
-                <w:sz w:val="20"/>
-                <w:szCs w:val="20"/>
-              </w:rPr>
-              <w:t xml:space="preserve">, </w:t>
-            </w:r>
-            <w:proofErr w:type="spellStart"/>
-            <w:r>
-              <w:rPr>
-                <w:sz w:val="20"/>
-                <w:szCs w:val="20"/>
-              </w:rPr>
-              <w:t>TemaConfig</w:t>
-            </w:r>
-            <w:proofErr w:type="spellEnd"/>
+            <w:r>
+              <w:rPr>
+                <w:sz w:val="20"/>
+                <w:szCs w:val="20"/>
+              </w:rPr>
+              <w:t>SecurityConfig, SenhaConfig, SessaoConfig, TemaConfig</w:t>
+            </w:r>
           </w:p>
         </w:tc>
       </w:tr>
@@ -2860,7 +2681,6 @@
               <w:keepLines/>
               <w:spacing w:after="40" w:line="240" w:lineRule="auto"/>
             </w:pPr>
-            <w:proofErr w:type="spellStart"/>
             <w:r>
               <w:rPr>
                 <w:b/>
@@ -2870,7 +2690,6 @@
               </w:rPr>
               <w:t>controller</w:t>
             </w:r>
-            <w:proofErr w:type="spellEnd"/>
           </w:p>
         </w:tc>
         <w:tc>
@@ -2917,88 +2736,14 @@
                 <w:lang w:val="en-US"/>
               </w:rPr>
             </w:pPr>
-            <w:proofErr w:type="spellStart"/>
             <w:r>
               <w:rPr>
                 <w:sz w:val="20"/>
                 <w:szCs w:val="20"/>
                 <w:lang w:val="en-US"/>
               </w:rPr>
-              <w:t>UsuarioController</w:t>
-            </w:r>
-            <w:proofErr w:type="spellEnd"/>
-            <w:r>
-              <w:rPr>
-                <w:sz w:val="20"/>
-                <w:szCs w:val="20"/>
-                <w:lang w:val="en-US"/>
-              </w:rPr>
-              <w:t xml:space="preserve">, </w:t>
-            </w:r>
-            <w:proofErr w:type="spellStart"/>
-            <w:r>
-              <w:rPr>
-                <w:sz w:val="20"/>
-                <w:szCs w:val="20"/>
-                <w:lang w:val="en-US"/>
-              </w:rPr>
-              <w:t>AutenticacaoController</w:t>
-            </w:r>
-            <w:proofErr w:type="spellEnd"/>
-            <w:r>
-              <w:rPr>
-                <w:sz w:val="20"/>
-                <w:szCs w:val="20"/>
-                <w:lang w:val="en-US"/>
-              </w:rPr>
-              <w:t xml:space="preserve">, </w:t>
-            </w:r>
-            <w:proofErr w:type="spellStart"/>
-            <w:r>
-              <w:rPr>
-                <w:sz w:val="20"/>
-                <w:szCs w:val="20"/>
-                <w:lang w:val="en-US"/>
-              </w:rPr>
-              <w:t>AreaController</w:t>
-            </w:r>
-            <w:proofErr w:type="spellEnd"/>
-            <w:r>
-              <w:rPr>
-                <w:sz w:val="20"/>
-                <w:szCs w:val="20"/>
-                <w:lang w:val="en-US"/>
-              </w:rPr>
-              <w:t xml:space="preserve">, </w:t>
-            </w:r>
-            <w:proofErr w:type="spellStart"/>
-            <w:r>
-              <w:rPr>
-                <w:sz w:val="20"/>
-                <w:szCs w:val="20"/>
-                <w:lang w:val="en-US"/>
-              </w:rPr>
-              <w:t>AdminUsuarioController</w:t>
-            </w:r>
-            <w:proofErr w:type="spellEnd"/>
-            <w:r>
-              <w:rPr>
-                <w:sz w:val="20"/>
-                <w:szCs w:val="20"/>
-                <w:lang w:val="en-US"/>
-              </w:rPr>
-              <w:t xml:space="preserve">, </w:t>
-            </w:r>
-            <w:proofErr w:type="spellStart"/>
-            <w:r>
-              <w:rPr>
-                <w:sz w:val="20"/>
-                <w:szCs w:val="20"/>
-                <w:lang w:val="en-US"/>
-              </w:rPr>
-              <w:t>TemaControllerAdvice</w:t>
-            </w:r>
-            <w:proofErr w:type="spellEnd"/>
+              <w:t>UsuarioController, AutenticacaoController, AreaController, AdminUsuarioController, TemaControllerAdvice</w:t>
+            </w:r>
           </w:p>
         </w:tc>
       </w:tr>
@@ -3022,7 +2767,6 @@
               <w:keepLines/>
               <w:spacing w:after="40" w:line="240" w:lineRule="auto"/>
             </w:pPr>
-            <w:proofErr w:type="spellStart"/>
             <w:r>
               <w:rPr>
                 <w:b/>
@@ -3032,7 +2776,6 @@
               </w:rPr>
               <w:t>dto</w:t>
             </w:r>
-            <w:proofErr w:type="spellEnd"/>
           </w:p>
         </w:tc>
         <w:tc>
@@ -3076,47 +2819,13 @@
               <w:keepLines/>
               <w:spacing w:after="40" w:line="240" w:lineRule="auto"/>
             </w:pPr>
-            <w:proofErr w:type="spellStart"/>
-            <w:r>
-              <w:rPr>
-                <w:sz w:val="20"/>
-                <w:szCs w:val="20"/>
-              </w:rPr>
-              <w:t>UsuarioRequestDTO</w:t>
-            </w:r>
-            <w:proofErr w:type="spellEnd"/>
-            <w:r>
-              <w:rPr>
-                <w:sz w:val="20"/>
-                <w:szCs w:val="20"/>
-              </w:rPr>
-              <w:t xml:space="preserve">, </w:t>
-            </w:r>
-            <w:proofErr w:type="spellStart"/>
-            <w:r>
-              <w:rPr>
-                <w:sz w:val="20"/>
-                <w:szCs w:val="20"/>
-              </w:rPr>
-              <w:t>UsuarioAtualizacaoRequestDTO</w:t>
-            </w:r>
-            <w:proofErr w:type="spellEnd"/>
-            <w:r>
-              <w:rPr>
-                <w:sz w:val="20"/>
-                <w:szCs w:val="20"/>
-              </w:rPr>
-              <w:t xml:space="preserve">, </w:t>
-            </w:r>
-            <w:proofErr w:type="spellStart"/>
-            <w:r>
-              <w:rPr>
-                <w:sz w:val="20"/>
-                <w:szCs w:val="20"/>
-              </w:rPr>
-              <w:t>UsuarioResponseDTO</w:t>
-            </w:r>
-            <w:proofErr w:type="spellEnd"/>
+            <w:r>
+              <w:rPr>
+                <w:sz w:val="20"/>
+                <w:szCs w:val="20"/>
+              </w:rPr>
+              <w:t>UsuarioRequestDTO, UsuarioAtualizacaoRequestDTO, UsuarioResponseDTO</w:t>
+            </w:r>
           </w:p>
         </w:tc>
       </w:tr>
@@ -3140,7 +2849,6 @@
               <w:keepLines/>
               <w:spacing w:after="40" w:line="240" w:lineRule="auto"/>
             </w:pPr>
-            <w:proofErr w:type="spellStart"/>
             <w:r>
               <w:rPr>
                 <w:b/>
@@ -3150,7 +2858,6 @@
               </w:rPr>
               <w:t>entity</w:t>
             </w:r>
-            <w:proofErr w:type="spellEnd"/>
           </w:p>
         </w:tc>
         <w:tc>
@@ -3194,31 +2901,13 @@
               <w:keepLines/>
               <w:spacing w:after="40" w:line="240" w:lineRule="auto"/>
             </w:pPr>
-            <w:proofErr w:type="spellStart"/>
-            <w:r>
-              <w:rPr>
-                <w:sz w:val="20"/>
-                <w:szCs w:val="20"/>
-              </w:rPr>
-              <w:t>UsuarioEntity</w:t>
-            </w:r>
-            <w:proofErr w:type="spellEnd"/>
-            <w:r>
-              <w:rPr>
-                <w:sz w:val="20"/>
-                <w:szCs w:val="20"/>
-              </w:rPr>
-              <w:t xml:space="preserve">, </w:t>
-            </w:r>
-            <w:proofErr w:type="spellStart"/>
-            <w:r>
-              <w:rPr>
-                <w:sz w:val="20"/>
-                <w:szCs w:val="20"/>
-              </w:rPr>
-              <w:t>PerfilEnum</w:t>
-            </w:r>
-            <w:proofErr w:type="spellEnd"/>
+            <w:r>
+              <w:rPr>
+                <w:sz w:val="20"/>
+                <w:szCs w:val="20"/>
+              </w:rPr>
+              <w:t>UsuarioEntity, PerfilEnum</w:t>
+            </w:r>
           </w:p>
         </w:tc>
       </w:tr>
@@ -3242,7 +2931,6 @@
               <w:keepLines/>
               <w:spacing w:after="40" w:line="240" w:lineRule="auto"/>
             </w:pPr>
-            <w:proofErr w:type="spellStart"/>
             <w:r>
               <w:rPr>
                 <w:b/>
@@ -3252,7 +2940,6 @@
               </w:rPr>
               <w:t>mapper</w:t>
             </w:r>
-            <w:proofErr w:type="spellEnd"/>
           </w:p>
         </w:tc>
         <w:tc>
@@ -3296,7 +2983,6 @@
               <w:keepLines/>
               <w:spacing w:after="40" w:line="240" w:lineRule="auto"/>
             </w:pPr>
-            <w:proofErr w:type="spellStart"/>
             <w:r>
               <w:rPr>
                 <w:sz w:val="20"/>
@@ -3304,7 +2990,6 @@
               </w:rPr>
               <w:t>UsuarioMapper</w:t>
             </w:r>
-            <w:proofErr w:type="spellEnd"/>
           </w:p>
         </w:tc>
       </w:tr>
@@ -3328,7 +3013,6 @@
               <w:keepLines/>
               <w:spacing w:after="40" w:line="240" w:lineRule="auto"/>
             </w:pPr>
-            <w:proofErr w:type="spellStart"/>
             <w:r>
               <w:rPr>
                 <w:b/>
@@ -3338,7 +3022,6 @@
               </w:rPr>
               <w:t>repository</w:t>
             </w:r>
-            <w:proofErr w:type="spellEnd"/>
           </w:p>
         </w:tc>
         <w:tc>
@@ -3362,23 +3045,7 @@
                 <w:sz w:val="20"/>
                 <w:szCs w:val="20"/>
               </w:rPr>
-              <w:t xml:space="preserve">Acesso ao </w:t>
-            </w:r>
-            <w:proofErr w:type="spellStart"/>
-            <w:r>
-              <w:rPr>
-                <w:sz w:val="20"/>
-                <w:szCs w:val="20"/>
-              </w:rPr>
-              <w:t>MongoDB</w:t>
-            </w:r>
-            <w:proofErr w:type="spellEnd"/>
-            <w:r>
-              <w:rPr>
-                <w:sz w:val="20"/>
-                <w:szCs w:val="20"/>
-              </w:rPr>
-              <w:t xml:space="preserve"> pelo Spring Data.</w:t>
+              <w:t>Acesso ao MongoDB pelo Spring Data.</w:t>
             </w:r>
           </w:p>
         </w:tc>
@@ -3398,7 +3065,6 @@
               <w:keepLines/>
               <w:spacing w:after="40" w:line="240" w:lineRule="auto"/>
             </w:pPr>
-            <w:proofErr w:type="spellStart"/>
             <w:r>
               <w:rPr>
                 <w:sz w:val="20"/>
@@ -3406,7 +3072,6 @@
               </w:rPr>
               <w:t>IUsuarioRepository</w:t>
             </w:r>
-            <w:proofErr w:type="spellEnd"/>
           </w:p>
         </w:tc>
       </w:tr>
@@ -3430,7 +3095,6 @@
               <w:keepLines/>
               <w:spacing w:after="40" w:line="240" w:lineRule="auto"/>
             </w:pPr>
-            <w:proofErr w:type="spellStart"/>
             <w:r>
               <w:rPr>
                 <w:b/>
@@ -3440,7 +3104,6 @@
               </w:rPr>
               <w:t>service</w:t>
             </w:r>
-            <w:proofErr w:type="spellEnd"/>
           </w:p>
         </w:tc>
         <w:tc>
@@ -3484,7 +3147,6 @@
               <w:keepLines/>
               <w:spacing w:after="40" w:line="240" w:lineRule="auto"/>
             </w:pPr>
-            <w:proofErr w:type="spellStart"/>
             <w:r>
               <w:rPr>
                 <w:sz w:val="20"/>
@@ -3492,7 +3154,6 @@
               </w:rPr>
               <w:t>IUsuarioService</w:t>
             </w:r>
-            <w:proofErr w:type="spellEnd"/>
           </w:p>
         </w:tc>
       </w:tr>
@@ -3516,7 +3177,6 @@
               <w:keepLines/>
               <w:spacing w:after="40" w:line="240" w:lineRule="auto"/>
             </w:pPr>
-            <w:proofErr w:type="spellStart"/>
             <w:r>
               <w:rPr>
                 <w:b/>
@@ -3526,7 +3186,6 @@
               </w:rPr>
               <w:t>service.impl</w:t>
             </w:r>
-            <w:proofErr w:type="spellEnd"/>
           </w:p>
         </w:tc>
         <w:tc>
@@ -3570,31 +3229,13 @@
               <w:keepLines/>
               <w:spacing w:after="40" w:line="240" w:lineRule="auto"/>
             </w:pPr>
-            <w:proofErr w:type="spellStart"/>
-            <w:r>
-              <w:rPr>
-                <w:sz w:val="20"/>
-                <w:szCs w:val="20"/>
-              </w:rPr>
-              <w:t>UsuarioService</w:t>
-            </w:r>
-            <w:proofErr w:type="spellEnd"/>
-            <w:r>
-              <w:rPr>
-                <w:sz w:val="20"/>
-                <w:szCs w:val="20"/>
-              </w:rPr>
-              <w:t xml:space="preserve">, </w:t>
-            </w:r>
-            <w:proofErr w:type="spellStart"/>
-            <w:r>
-              <w:rPr>
-                <w:sz w:val="20"/>
-                <w:szCs w:val="20"/>
-              </w:rPr>
-              <w:t>UsuarioDetailsService</w:t>
-            </w:r>
-            <w:proofErr w:type="spellEnd"/>
+            <w:r>
+              <w:rPr>
+                <w:sz w:val="20"/>
+                <w:szCs w:val="20"/>
+              </w:rPr>
+              <w:t>UsuarioService, UsuarioDetailsService</w:t>
+            </w:r>
           </w:p>
         </w:tc>
       </w:tr>
@@ -3617,95 +3258,7 @@
         <w:jc w:val="both"/>
       </w:pPr>
       <w:r>
-        <w:t xml:space="preserve">A interface fica em </w:t>
-      </w:r>
-      <w:proofErr w:type="spellStart"/>
-      <w:r>
-        <w:t>src</w:t>
-      </w:r>
-      <w:proofErr w:type="spellEnd"/>
-      <w:r>
-        <w:t>/</w:t>
-      </w:r>
-      <w:proofErr w:type="spellStart"/>
-      <w:r>
-        <w:t>main</w:t>
-      </w:r>
-      <w:proofErr w:type="spellEnd"/>
-      <w:r>
-        <w:t>/</w:t>
-      </w:r>
-      <w:proofErr w:type="spellStart"/>
-      <w:r>
-        <w:t>resources</w:t>
-      </w:r>
-      <w:proofErr w:type="spellEnd"/>
-      <w:r>
-        <w:t xml:space="preserve">. A pasta </w:t>
-      </w:r>
-      <w:proofErr w:type="spellStart"/>
-      <w:r>
-        <w:t>templates</w:t>
-      </w:r>
-      <w:proofErr w:type="spellEnd"/>
-      <w:r>
-        <w:t xml:space="preserve"> guarda as páginas </w:t>
-      </w:r>
-      <w:proofErr w:type="spellStart"/>
-      <w:r>
-        <w:t>Thymeleaf</w:t>
-      </w:r>
-      <w:proofErr w:type="spellEnd"/>
-      <w:r>
-        <w:t xml:space="preserve">, e o arquivo </w:t>
-      </w:r>
-      <w:proofErr w:type="spellStart"/>
-      <w:r>
-        <w:t>templates</w:t>
-      </w:r>
-      <w:proofErr w:type="spellEnd"/>
-      <w:r>
-        <w:t xml:space="preserve">/fragmentos/layout.html reúne o que todas as páginas compartilham: o </w:t>
-      </w:r>
-      <w:proofErr w:type="spellStart"/>
-      <w:r>
-        <w:t>head</w:t>
-      </w:r>
-      <w:proofErr w:type="spellEnd"/>
-      <w:r>
-        <w:t xml:space="preserve">, o cabeçalho com o menu e o rodapé. Os estilos ficam em </w:t>
-      </w:r>
-      <w:proofErr w:type="spellStart"/>
-      <w:r>
-        <w:t>static</w:t>
-      </w:r>
-      <w:proofErr w:type="spellEnd"/>
-      <w:r>
-        <w:t>/</w:t>
-      </w:r>
-      <w:proofErr w:type="spellStart"/>
-      <w:r>
-        <w:t>css</w:t>
-      </w:r>
-      <w:proofErr w:type="spellEnd"/>
-      <w:r>
-        <w:t xml:space="preserve">. O arquivo estilo.css define o layout, e a pasta </w:t>
-      </w:r>
-      <w:proofErr w:type="spellStart"/>
-      <w:r>
-        <w:t>static</w:t>
-      </w:r>
-      <w:proofErr w:type="spellEnd"/>
-      <w:r>
-        <w:t>/</w:t>
-      </w:r>
-      <w:proofErr w:type="spellStart"/>
-      <w:r>
-        <w:t>css</w:t>
-      </w:r>
-      <w:proofErr w:type="spellEnd"/>
-      <w:r>
-        <w:t>/temas tem um arquivo CSS por tema, cada um só com as variáveis de cor.</w:t>
+        <w:t>A interface fica em src/main/resources. A pasta templates guarda as páginas Thymeleaf, e o arquivo templates/fragmentos/layout.html reúne o que todas as páginas compartilham: o head, o cabeçalho com o menu e o rodapé. Os estilos ficam em static/css. O arquivo estilo.css define o layout, e a pasta static/css/temas tem um arquivo CSS por tema, cada um só com as variáveis de cor.</w:t>
       </w:r>
     </w:p>
     <w:p>
@@ -3726,39 +3279,7 @@
         <w:jc w:val="both"/>
       </w:pPr>
       <w:r>
-        <w:t xml:space="preserve">O quadro 3 acompanha um cadastro desde o formulário até o banco, passando por formulário, </w:t>
-      </w:r>
-      <w:proofErr w:type="spellStart"/>
-      <w:r>
-        <w:t>controller</w:t>
-      </w:r>
-      <w:proofErr w:type="spellEnd"/>
-      <w:r>
-        <w:t xml:space="preserve">, </w:t>
-      </w:r>
-      <w:proofErr w:type="spellStart"/>
-      <w:r>
-        <w:t>service</w:t>
-      </w:r>
-      <w:proofErr w:type="spellEnd"/>
-      <w:r>
-        <w:t xml:space="preserve">, </w:t>
-      </w:r>
-      <w:proofErr w:type="spellStart"/>
-      <w:r>
-        <w:t>repository</w:t>
-      </w:r>
-      <w:proofErr w:type="spellEnd"/>
-      <w:r>
-        <w:t xml:space="preserve"> e </w:t>
-      </w:r>
-      <w:proofErr w:type="spellStart"/>
-      <w:r>
-        <w:t>MongoDB</w:t>
-      </w:r>
-      <w:proofErr w:type="spellEnd"/>
-      <w:r>
-        <w:t>. As outras operações seguem o mesmo caminho.</w:t>
+        <w:t>O quadro 3 acompanha um cadastro desde o formulário até o banco, passando por formulário, controller, service, repository e MongoDB. As outras operações seguem o mesmo caminho.</w:t>
       </w:r>
     </w:p>
     <w:p>
@@ -3961,23 +3482,7 @@
                 <w:sz w:val="20"/>
                 <w:szCs w:val="20"/>
               </w:rPr>
-              <w:t xml:space="preserve">O visitante preenche nome, e-mail e senha. O </w:t>
-            </w:r>
-            <w:proofErr w:type="spellStart"/>
-            <w:r>
-              <w:rPr>
-                <w:sz w:val="20"/>
-                <w:szCs w:val="20"/>
-              </w:rPr>
-              <w:t>Thymeleaf</w:t>
-            </w:r>
-            <w:proofErr w:type="spellEnd"/>
-            <w:r>
-              <w:rPr>
-                <w:sz w:val="20"/>
-                <w:szCs w:val="20"/>
-              </w:rPr>
-              <w:t xml:space="preserve"> inclui o token CSRF no formulário, e o navegador envia um POST para /cadastro.</w:t>
+              <w:t>O visitante preenche nome, e-mail e senha. O Thymeleaf inclui o token CSRF no formulário, e o navegador envia um POST para /cadastro.</w:t>
             </w:r>
           </w:p>
         </w:tc>
@@ -4027,37 +3532,12 @@
               <w:keepLines/>
               <w:spacing w:after="40" w:line="240" w:lineRule="auto"/>
             </w:pPr>
-            <w:proofErr w:type="spellStart"/>
-            <w:r>
-              <w:rPr>
-                <w:sz w:val="20"/>
-                <w:szCs w:val="20"/>
-              </w:rPr>
-              <w:t>Controller</w:t>
-            </w:r>
-            <w:proofErr w:type="spellEnd"/>
-            <w:r>
-              <w:rPr>
-                <w:sz w:val="20"/>
-                <w:szCs w:val="20"/>
-              </w:rPr>
-              <w:t xml:space="preserve"> (</w:t>
-            </w:r>
-            <w:proofErr w:type="spellStart"/>
-            <w:r>
-              <w:rPr>
-                <w:sz w:val="20"/>
-                <w:szCs w:val="20"/>
-              </w:rPr>
-              <w:t>UsuarioController</w:t>
-            </w:r>
-            <w:proofErr w:type="spellEnd"/>
-            <w:r>
-              <w:rPr>
-                <w:sz w:val="20"/>
-                <w:szCs w:val="20"/>
-              </w:rPr>
-              <w:t>)</w:t>
+            <w:r>
+              <w:rPr>
+                <w:sz w:val="20"/>
+                <w:szCs w:val="20"/>
+              </w:rPr>
+              <w:t>Controller (UsuarioController)</w:t>
             </w:r>
           </w:p>
         </w:tc>
@@ -4082,23 +3562,7 @@
                 <w:sz w:val="20"/>
                 <w:szCs w:val="20"/>
               </w:rPr>
-              <w:t xml:space="preserve">O Spring monta um </w:t>
-            </w:r>
-            <w:proofErr w:type="spellStart"/>
-            <w:r>
-              <w:rPr>
-                <w:sz w:val="20"/>
-                <w:szCs w:val="20"/>
-              </w:rPr>
-              <w:t>UsuarioRequestDTO</w:t>
-            </w:r>
-            <w:proofErr w:type="spellEnd"/>
-            <w:r>
-              <w:rPr>
-                <w:sz w:val="20"/>
-                <w:szCs w:val="20"/>
-              </w:rPr>
-              <w:t xml:space="preserve"> e valida as anotações @NotBlank, @Email e @Size. Se houver erro, a página volta com a mensagem junto ao campo.</w:t>
+              <w:t>O Spring monta um UsuarioRequestDTO e valida as anotações @NotBlank, @Email e @Size. Se houver erro, a página volta com a mensagem junto ao campo.</w:t>
             </w:r>
           </w:p>
         </w:tc>
@@ -4153,23 +3617,7 @@
                 <w:sz w:val="20"/>
                 <w:szCs w:val="20"/>
               </w:rPr>
-              <w:t>Service (</w:t>
-            </w:r>
-            <w:proofErr w:type="spellStart"/>
-            <w:r>
-              <w:rPr>
-                <w:sz w:val="20"/>
-                <w:szCs w:val="20"/>
-              </w:rPr>
-              <w:t>UsuarioService</w:t>
-            </w:r>
-            <w:proofErr w:type="spellEnd"/>
-            <w:r>
-              <w:rPr>
-                <w:sz w:val="20"/>
-                <w:szCs w:val="20"/>
-              </w:rPr>
-              <w:t>)</w:t>
+              <w:t>Service (UsuarioService)</w:t>
             </w:r>
           </w:p>
         </w:tc>
@@ -4194,39 +3642,7 @@
                 <w:sz w:val="20"/>
                 <w:szCs w:val="20"/>
               </w:rPr>
-              <w:t xml:space="preserve">Normaliza o e-mail (sem espaços nas pontas e em minúsculas), recusa e-mail já cadastrado, confere o limite de 72 bytes da senha, define o perfil USER e gera o </w:t>
-            </w:r>
-            <w:proofErr w:type="spellStart"/>
-            <w:r>
-              <w:rPr>
-                <w:sz w:val="20"/>
-                <w:szCs w:val="20"/>
-              </w:rPr>
-              <w:t>hash</w:t>
-            </w:r>
-            <w:proofErr w:type="spellEnd"/>
-            <w:r>
-              <w:rPr>
-                <w:sz w:val="20"/>
-                <w:szCs w:val="20"/>
-              </w:rPr>
-              <w:t xml:space="preserve"> </w:t>
-            </w:r>
-            <w:proofErr w:type="spellStart"/>
-            <w:r>
-              <w:rPr>
-                <w:sz w:val="20"/>
-                <w:szCs w:val="20"/>
-              </w:rPr>
-              <w:t>BCrypt</w:t>
-            </w:r>
-            <w:proofErr w:type="spellEnd"/>
-            <w:r>
-              <w:rPr>
-                <w:sz w:val="20"/>
-                <w:szCs w:val="20"/>
-              </w:rPr>
-              <w:t>.</w:t>
+              <w:t>Normaliza o e-mail (sem espaços nas pontas e em minúsculas), recusa e-mail já cadastrado, confere o limite de 72 bytes da senha, define o perfil USER e gera o hash BCrypt.</w:t>
             </w:r>
           </w:p>
         </w:tc>
@@ -4276,37 +3692,12 @@
               <w:keepLines/>
               <w:spacing w:after="40" w:line="240" w:lineRule="auto"/>
             </w:pPr>
-            <w:proofErr w:type="spellStart"/>
-            <w:r>
-              <w:rPr>
-                <w:sz w:val="20"/>
-                <w:szCs w:val="20"/>
-              </w:rPr>
-              <w:t>Mapper</w:t>
-            </w:r>
-            <w:proofErr w:type="spellEnd"/>
-            <w:r>
-              <w:rPr>
-                <w:sz w:val="20"/>
-                <w:szCs w:val="20"/>
-              </w:rPr>
-              <w:t xml:space="preserve"> (</w:t>
-            </w:r>
-            <w:proofErr w:type="spellStart"/>
-            <w:r>
-              <w:rPr>
-                <w:sz w:val="20"/>
-                <w:szCs w:val="20"/>
-              </w:rPr>
-              <w:t>UsuarioMapper</w:t>
-            </w:r>
-            <w:proofErr w:type="spellEnd"/>
-            <w:r>
-              <w:rPr>
-                <w:sz w:val="20"/>
-                <w:szCs w:val="20"/>
-              </w:rPr>
-              <w:t>)</w:t>
+            <w:r>
+              <w:rPr>
+                <w:sz w:val="20"/>
+                <w:szCs w:val="20"/>
+              </w:rPr>
+              <w:t>Mapper (UsuarioMapper)</w:t>
             </w:r>
           </w:p>
         </w:tc>
@@ -4331,39 +3722,7 @@
                 <w:sz w:val="20"/>
                 <w:szCs w:val="20"/>
               </w:rPr>
-              <w:t xml:space="preserve">Converte o DTO em </w:t>
-            </w:r>
-            <w:proofErr w:type="spellStart"/>
-            <w:r>
-              <w:rPr>
-                <w:sz w:val="20"/>
-                <w:szCs w:val="20"/>
-              </w:rPr>
-              <w:t>UsuarioEntity</w:t>
-            </w:r>
-            <w:proofErr w:type="spellEnd"/>
-            <w:r>
-              <w:rPr>
-                <w:sz w:val="20"/>
-                <w:szCs w:val="20"/>
-              </w:rPr>
-              <w:t xml:space="preserve"> e, depois de salvar, converte a entidade em </w:t>
-            </w:r>
-            <w:proofErr w:type="spellStart"/>
-            <w:r>
-              <w:rPr>
-                <w:sz w:val="20"/>
-                <w:szCs w:val="20"/>
-              </w:rPr>
-              <w:t>UsuarioResponseDTO</w:t>
-            </w:r>
-            <w:proofErr w:type="spellEnd"/>
-            <w:r>
-              <w:rPr>
-                <w:sz w:val="20"/>
-                <w:szCs w:val="20"/>
-              </w:rPr>
-              <w:t>.</w:t>
+              <w:t>Converte o DTO em UsuarioEntity e, depois de salvar, converte a entidade em UsuarioResponseDTO.</w:t>
             </w:r>
           </w:p>
         </w:tc>
@@ -4413,37 +3772,12 @@
               <w:keepLines/>
               <w:spacing w:after="40" w:line="240" w:lineRule="auto"/>
             </w:pPr>
-            <w:proofErr w:type="spellStart"/>
-            <w:r>
-              <w:rPr>
-                <w:sz w:val="20"/>
-                <w:szCs w:val="20"/>
-              </w:rPr>
-              <w:t>Repository</w:t>
-            </w:r>
-            <w:proofErr w:type="spellEnd"/>
-            <w:r>
-              <w:rPr>
-                <w:sz w:val="20"/>
-                <w:szCs w:val="20"/>
-              </w:rPr>
-              <w:t xml:space="preserve"> (</w:t>
-            </w:r>
-            <w:proofErr w:type="spellStart"/>
-            <w:r>
-              <w:rPr>
-                <w:sz w:val="20"/>
-                <w:szCs w:val="20"/>
-              </w:rPr>
-              <w:t>IUsuarioRepository</w:t>
-            </w:r>
-            <w:proofErr w:type="spellEnd"/>
-            <w:r>
-              <w:rPr>
-                <w:sz w:val="20"/>
-                <w:szCs w:val="20"/>
-              </w:rPr>
-              <w:t>)</w:t>
+            <w:r>
+              <w:rPr>
+                <w:sz w:val="20"/>
+                <w:szCs w:val="20"/>
+              </w:rPr>
+              <w:t>Repository (IUsuarioRepository)</w:t>
             </w:r>
           </w:p>
         </w:tc>
@@ -4468,23 +3802,7 @@
                 <w:sz w:val="20"/>
                 <w:szCs w:val="20"/>
               </w:rPr>
-              <w:t xml:space="preserve">O método </w:t>
-            </w:r>
-            <w:proofErr w:type="spellStart"/>
-            <w:r>
-              <w:rPr>
-                <w:sz w:val="20"/>
-                <w:szCs w:val="20"/>
-              </w:rPr>
-              <w:t>save</w:t>
-            </w:r>
-            <w:proofErr w:type="spellEnd"/>
-            <w:r>
-              <w:rPr>
-                <w:sz w:val="20"/>
-                <w:szCs w:val="20"/>
-              </w:rPr>
-              <w:t xml:space="preserve"> do Spring Data grava o documento.</w:t>
+              <w:t>O método save do Spring Data grava o documento.</w:t>
             </w:r>
           </w:p>
         </w:tc>
@@ -4534,21 +3852,12 @@
               <w:keepLines/>
               <w:spacing w:after="40" w:line="240" w:lineRule="auto"/>
             </w:pPr>
-            <w:proofErr w:type="spellStart"/>
-            <w:r>
-              <w:rPr>
-                <w:sz w:val="20"/>
-                <w:szCs w:val="20"/>
-              </w:rPr>
-              <w:t>MongoDB</w:t>
-            </w:r>
-            <w:proofErr w:type="spellEnd"/>
-            <w:r>
-              <w:rPr>
-                <w:sz w:val="20"/>
-                <w:szCs w:val="20"/>
-              </w:rPr>
-              <w:t xml:space="preserve"> Atlas</w:t>
+            <w:r>
+              <w:rPr>
+                <w:sz w:val="20"/>
+                <w:szCs w:val="20"/>
+              </w:rPr>
+              <w:t>MongoDB Atlas</w:t>
             </w:r>
           </w:p>
         </w:tc>
@@ -4573,23 +3882,7 @@
                 <w:sz w:val="20"/>
                 <w:szCs w:val="20"/>
               </w:rPr>
-              <w:t xml:space="preserve">O documento entra na coleção </w:t>
-            </w:r>
-            <w:proofErr w:type="spellStart"/>
-            <w:r>
-              <w:rPr>
-                <w:sz w:val="20"/>
-                <w:szCs w:val="20"/>
-              </w:rPr>
-              <w:t>usuarios</w:t>
-            </w:r>
-            <w:proofErr w:type="spellEnd"/>
-            <w:r>
-              <w:rPr>
-                <w:sz w:val="20"/>
-                <w:szCs w:val="20"/>
-              </w:rPr>
-              <w:t>. O índice único do e-mail barra a duplicidade mesmo se duas requisições chegarem ao mesmo tempo.</w:t>
+              <w:t>O documento entra na coleção usuarios. O índice único do e-mail barra a duplicidade mesmo se duas requisições chegarem ao mesmo tempo.</w:t>
             </w:r>
           </w:p>
         </w:tc>
@@ -4639,7 +3932,6 @@
               <w:keepLines/>
               <w:spacing w:after="40" w:line="240" w:lineRule="auto"/>
             </w:pPr>
-            <w:proofErr w:type="spellStart"/>
             <w:r>
               <w:rPr>
                 <w:sz w:val="20"/>
@@ -4647,7 +3939,6 @@
               </w:rPr>
               <w:t>Controller</w:t>
             </w:r>
-            <w:proofErr w:type="spellEnd"/>
           </w:p>
         </w:tc>
         <w:tc>
@@ -4695,55 +3986,7 @@
         <w:jc w:val="both"/>
       </w:pPr>
       <w:r>
-        <w:t xml:space="preserve">O login segue um caminho parecido, mas quem conduz é o Spring Security. O filtro de login recebe e-mail e senha, o </w:t>
-      </w:r>
-      <w:proofErr w:type="spellStart"/>
-      <w:r>
-        <w:t>UsuarioDetailsService</w:t>
-      </w:r>
-      <w:proofErr w:type="spellEnd"/>
-      <w:r>
-        <w:t xml:space="preserve"> busca o usuário pelo e-mail normalizado e devolve o </w:t>
-      </w:r>
-      <w:proofErr w:type="spellStart"/>
-      <w:r>
-        <w:t>hash</w:t>
-      </w:r>
-      <w:proofErr w:type="spellEnd"/>
-      <w:r>
-        <w:t xml:space="preserve"> e o perfil, e o </w:t>
-      </w:r>
-      <w:proofErr w:type="spellStart"/>
-      <w:r>
-        <w:t>PasswordEncoder</w:t>
-      </w:r>
-      <w:proofErr w:type="spellEnd"/>
-      <w:r>
-        <w:t xml:space="preserve"> compara a senha digitada com o </w:t>
-      </w:r>
-      <w:proofErr w:type="spellStart"/>
-      <w:r>
-        <w:t>hash</w:t>
-      </w:r>
-      <w:proofErr w:type="spellEnd"/>
-      <w:r>
-        <w:t xml:space="preserve">. Se tudo confere, a sessão </w:t>
-      </w:r>
-      <w:proofErr w:type="spellStart"/>
-      <w:r>
-        <w:t>é</w:t>
-      </w:r>
-      <w:proofErr w:type="spellEnd"/>
-      <w:r>
-        <w:t xml:space="preserve"> criada e gravada na coleção </w:t>
-      </w:r>
-      <w:proofErr w:type="spellStart"/>
-      <w:r>
-        <w:t>sessoes</w:t>
-      </w:r>
-      <w:proofErr w:type="spellEnd"/>
-      <w:r>
-        <w:t>.</w:t>
+        <w:t>O login segue um caminho parecido, mas quem conduz é o Spring Security. O filtro de login recebe e-mail e senha, o UsuarioDetailsService busca o usuário pelo e-mail normalizado e devolve o hash e o perfil, e o PasswordEncoder compara a senha digitada com o hash. Se tudo confere, a sessão é criada e gravada na coleção sessoes.</w:t>
       </w:r>
     </w:p>
     <w:p>
@@ -4762,63 +4005,7 @@
         <w:jc w:val="both"/>
       </w:pPr>
       <w:r>
-        <w:t xml:space="preserve">Os </w:t>
-      </w:r>
-      <w:proofErr w:type="spellStart"/>
-      <w:r>
-        <w:t>DTOs</w:t>
-      </w:r>
-      <w:proofErr w:type="spellEnd"/>
-      <w:r>
-        <w:t xml:space="preserve"> (Data </w:t>
-      </w:r>
-      <w:proofErr w:type="spellStart"/>
-      <w:r>
-        <w:t>Transfer</w:t>
-      </w:r>
-      <w:proofErr w:type="spellEnd"/>
-      <w:r>
-        <w:t xml:space="preserve"> </w:t>
-      </w:r>
-      <w:proofErr w:type="spellStart"/>
-      <w:r>
-        <w:t>Objects</w:t>
-      </w:r>
-      <w:proofErr w:type="spellEnd"/>
-      <w:r>
-        <w:t xml:space="preserve">) são </w:t>
-      </w:r>
-      <w:proofErr w:type="spellStart"/>
-      <w:r>
-        <w:t>records</w:t>
-      </w:r>
-      <w:proofErr w:type="spellEnd"/>
-      <w:r>
-        <w:t xml:space="preserve"> Java que carregam só os dados de cada operação. O </w:t>
-      </w:r>
-      <w:proofErr w:type="spellStart"/>
-      <w:r>
-        <w:t>UsuarioRequestDTO</w:t>
-      </w:r>
-      <w:proofErr w:type="spellEnd"/>
-      <w:r>
-        <w:t xml:space="preserve"> tem nome, e-mail e senha e é usado no cadastro. O </w:t>
-      </w:r>
-      <w:proofErr w:type="spellStart"/>
-      <w:r>
-        <w:t>UsuarioAtualizacaoRequestDTO</w:t>
-      </w:r>
-      <w:proofErr w:type="spellEnd"/>
-      <w:r>
-        <w:t xml:space="preserve"> tem nome, e-mail e perfil e é usado na edição feita pelo administrador. O </w:t>
-      </w:r>
-      <w:proofErr w:type="spellStart"/>
-      <w:r>
-        <w:t>UsuarioResponseDTO</w:t>
-      </w:r>
-      <w:proofErr w:type="spellEnd"/>
-      <w:r>
-        <w:t xml:space="preserve"> tem id, nome, e-mail e perfil e é o que chega às páginas.</w:t>
+        <w:t>Os DTOs (Data Transfer Objects) são records Java que carregam só os dados de cada operação. O UsuarioRequestDTO tem nome, e-mail e senha e é usado no cadastro. O UsuarioAtualizacaoRequestDTO tem nome, e-mail e perfil e é usado na edição feita pelo administrador. O UsuarioResponseDTO tem id, nome, e-mail e perfil e é o que chega às páginas.</w:t>
       </w:r>
     </w:p>
     <w:p>
@@ -4828,31 +4015,7 @@
       </w:pPr>
       <w:r>
         <w:lastRenderedPageBreak/>
-        <w:t xml:space="preserve">Essa separação tem um motivo de segurança. A entidade tem os campos </w:t>
-      </w:r>
-      <w:proofErr w:type="spellStart"/>
-      <w:r>
-        <w:t>senhaHash</w:t>
-      </w:r>
-      <w:proofErr w:type="spellEnd"/>
-      <w:r>
-        <w:t xml:space="preserve"> e perfil. Se o formulário fosse ligado direto a ela, alguém poderia enviar o perfil ADMIN no cadastro ou ver o </w:t>
-      </w:r>
-      <w:proofErr w:type="spellStart"/>
-      <w:r>
-        <w:t>hash</w:t>
-      </w:r>
-      <w:proofErr w:type="spellEnd"/>
-      <w:r>
-        <w:t xml:space="preserve"> numa página. Como o DTO de cadastro não tem o campo perfil e o DTO de resposta não tem o </w:t>
-      </w:r>
-      <w:proofErr w:type="spellStart"/>
-      <w:r>
-        <w:t>hash</w:t>
-      </w:r>
-      <w:proofErr w:type="spellEnd"/>
-      <w:r>
-        <w:t>, isso não acontece. Além disso, as regras de validação de cada formulário ficam no seu DTO, e o mesmo campo pode ter regras diferentes em operações diferentes.</w:t>
+        <w:t>Essa separação tem um motivo de segurança. A entidade tem os campos senhaHash e perfil. Se o formulário fosse ligado direto a ela, alguém poderia enviar o perfil ADMIN no cadastro ou ver o hash numa página. Como o DTO de cadastro não tem o campo perfil e o DTO de resposta não tem o hash, isso não acontece. Além disso, as regras de validação de cada formulário ficam no seu DTO, e o mesmo campo pode ter regras diferentes em operações diferentes.</w:t>
       </w:r>
     </w:p>
     <w:p>
@@ -4861,23 +4024,7 @@
         <w:jc w:val="both"/>
       </w:pPr>
       <w:r>
-        <w:t xml:space="preserve">O </w:t>
-      </w:r>
-      <w:proofErr w:type="spellStart"/>
-      <w:r>
-        <w:t>UsuarioMapper</w:t>
-      </w:r>
-      <w:proofErr w:type="spellEnd"/>
-      <w:r>
-        <w:t xml:space="preserve"> concentra a conversão entre entidade e DTO. </w:t>
-      </w:r>
-      <w:proofErr w:type="spellStart"/>
-      <w:r>
-        <w:t>Controllers</w:t>
-      </w:r>
-      <w:proofErr w:type="spellEnd"/>
-      <w:r>
-        <w:t xml:space="preserve"> e serviços não montam objetos campo a campo, e se a entidade ganhar um atributo novo, a mudança fica em um lugar só.</w:t>
+        <w:t>O UsuarioMapper concentra a conversão entre entidade e DTO. Controllers e serviços não montam objetos campo a campo, e se a entidade ganhar um atributo novo, a mudança fica em um lugar só.</w:t>
       </w:r>
     </w:p>
     <w:p>
@@ -4898,31 +4045,7 @@
         <w:jc w:val="both"/>
       </w:pPr>
       <w:r>
-        <w:t xml:space="preserve">O </w:t>
-      </w:r>
-      <w:proofErr w:type="spellStart"/>
-      <w:r>
-        <w:t>MongoDB</w:t>
-      </w:r>
-      <w:proofErr w:type="spellEnd"/>
-      <w:r>
-        <w:t xml:space="preserve"> Atlas guarda os dois tipos de dado do sistema: os usuários e as sessões. Os usuários são gravados pelo Spring Data </w:t>
-      </w:r>
-      <w:proofErr w:type="spellStart"/>
-      <w:r>
-        <w:t>MongoDB</w:t>
-      </w:r>
-      <w:proofErr w:type="spellEnd"/>
-      <w:r>
-        <w:t xml:space="preserve">, e as sessões pela biblioteca </w:t>
-      </w:r>
-      <w:proofErr w:type="spellStart"/>
-      <w:r>
-        <w:t>mongodb-spring-session</w:t>
-      </w:r>
-      <w:proofErr w:type="spellEnd"/>
-      <w:r>
-        <w:t>.</w:t>
+        <w:t>O MongoDB Atlas guarda os dois tipos de dado do sistema: os usuários e as sessões. Os usuários são gravados pelo Spring Data MongoDB, e as sessões pela biblioteca mongodb-spring-session.</w:t>
       </w:r>
     </w:p>
     <w:p>
@@ -4942,23 +4065,7 @@
         <w:jc w:val="both"/>
       </w:pPr>
       <w:r>
-        <w:t xml:space="preserve">O endereço de conexão nunca aparece no código. O arquivo </w:t>
-      </w:r>
-      <w:proofErr w:type="spellStart"/>
-      <w:r>
-        <w:t>application.properties</w:t>
-      </w:r>
-      <w:proofErr w:type="spellEnd"/>
-      <w:r>
-        <w:t xml:space="preserve"> só faz referência à variável de ambiente MONGODB_URI, e cada máquina que executa o sistema define essa variável com a URI do seu cluster. O arquivo </w:t>
-      </w:r>
-      <w:proofErr w:type="spellStart"/>
-      <w:r>
-        <w:t>versionado</w:t>
-      </w:r>
-      <w:proofErr w:type="spellEnd"/>
-      <w:r>
-        <w:t xml:space="preserve"> no GitHub não tem credenciais e fica assim:</w:t>
+        <w:t>O endereço de conexão nunca aparece no código. O arquivo application.properties só faz referência à variável de ambiente MONGODB_URI, e cada máquina que executa o sistema define essa variável com a URI do seu cluster. O arquivo versionado no GitHub não tem credenciais e fica assim:</w:t>
       </w:r>
     </w:p>
     <w:p>
@@ -4979,19 +4086,8 @@
           <w:szCs w:val="20"/>
           <w:lang w:val="en-US"/>
         </w:rPr>
-        <w:t>spring.application.name=login-</w:t>
-      </w:r>
-      <w:proofErr w:type="spellStart"/>
-      <w:r>
-        <w:rPr>
-          <w:rFonts w:ascii="Courier New" w:eastAsia="Courier New" w:hAnsi="Courier New" w:cs="Courier New"/>
-          <w:sz w:val="20"/>
-          <w:szCs w:val="20"/>
-          <w:lang w:val="en-US"/>
-        </w:rPr>
-        <w:t>seguro</w:t>
-      </w:r>
-      <w:proofErr w:type="spellEnd"/>
+        <w:t>spring.application.name=login-seguro</w:t>
+      </w:r>
     </w:p>
     <w:p>
       <w:pPr>
@@ -5004,7 +4100,6 @@
           <w:lang w:val="en-US"/>
         </w:rPr>
       </w:pPr>
-      <w:proofErr w:type="spellStart"/>
       <w:r>
         <w:rPr>
           <w:rFonts w:ascii="Courier New" w:eastAsia="Courier New" w:hAnsi="Courier New" w:cs="Courier New"/>
@@ -5012,17 +4107,7 @@
           <w:szCs w:val="20"/>
           <w:lang w:val="en-US"/>
         </w:rPr>
-        <w:t>spring.mongodb.uri</w:t>
-      </w:r>
-      <w:proofErr w:type="spellEnd"/>
-      <w:r>
-        <w:rPr>
-          <w:rFonts w:ascii="Courier New" w:eastAsia="Courier New" w:hAnsi="Courier New" w:cs="Courier New"/>
-          <w:sz w:val="20"/>
-          <w:szCs w:val="20"/>
-          <w:lang w:val="en-US"/>
-        </w:rPr>
-        <w:t>=${MONGODB_URI}</w:t>
+        <w:t>spring.mongodb.uri=${MONGODB_URI}</w:t>
       </w:r>
     </w:p>
     <w:p>
@@ -5036,7 +4121,6 @@
           <w:lang w:val="en-US"/>
         </w:rPr>
       </w:pPr>
-      <w:proofErr w:type="spellStart"/>
       <w:r>
         <w:rPr>
           <w:rFonts w:ascii="Courier New" w:eastAsia="Courier New" w:hAnsi="Courier New" w:cs="Courier New"/>
@@ -5044,29 +4128,8 @@
           <w:szCs w:val="20"/>
           <w:lang w:val="en-US"/>
         </w:rPr>
-        <w:t>spring.mongodb.database</w:t>
-      </w:r>
-      <w:proofErr w:type="spellEnd"/>
-      <w:r>
-        <w:rPr>
-          <w:rFonts w:ascii="Courier New" w:eastAsia="Courier New" w:hAnsi="Courier New" w:cs="Courier New"/>
-          <w:sz w:val="20"/>
-          <w:szCs w:val="20"/>
-          <w:lang w:val="en-US"/>
-        </w:rPr>
-        <w:t>=</w:t>
-      </w:r>
-      <w:proofErr w:type="spellStart"/>
-      <w:r>
-        <w:rPr>
-          <w:rFonts w:ascii="Courier New" w:eastAsia="Courier New" w:hAnsi="Courier New" w:cs="Courier New"/>
-          <w:sz w:val="20"/>
-          <w:szCs w:val="20"/>
-          <w:lang w:val="en-US"/>
-        </w:rPr>
-        <w:t>login_seguro</w:t>
-      </w:r>
-      <w:proofErr w:type="spellEnd"/>
+        <w:t>spring.mongodb.database=login_seguro</w:t>
+      </w:r>
     </w:p>
     <w:p>
       <w:pPr>
@@ -5079,7 +4142,6 @@
           <w:lang w:val="en-US"/>
         </w:rPr>
       </w:pPr>
-      <w:proofErr w:type="spellStart"/>
       <w:r>
         <w:rPr>
           <w:rFonts w:ascii="Courier New" w:eastAsia="Courier New" w:hAnsi="Courier New" w:cs="Courier New"/>
@@ -5087,17 +4149,7 @@
           <w:szCs w:val="20"/>
           <w:lang w:val="en-US"/>
         </w:rPr>
-        <w:t>spring.data.mongodb.auto</w:t>
-      </w:r>
-      <w:proofErr w:type="spellEnd"/>
-      <w:r>
-        <w:rPr>
-          <w:rFonts w:ascii="Courier New" w:eastAsia="Courier New" w:hAnsi="Courier New" w:cs="Courier New"/>
-          <w:sz w:val="20"/>
-          <w:szCs w:val="20"/>
-          <w:lang w:val="en-US"/>
-        </w:rPr>
-        <w:t>-index-creation=true</w:t>
+        <w:t>spring.data.mongodb.auto-index-creation=true</w:t>
       </w:r>
     </w:p>
     <w:p>
@@ -5108,60 +4160,30 @@
         <w:spacing w:line="240" w:lineRule="auto"/>
         <w:ind w:left="709"/>
       </w:pPr>
-      <w:proofErr w:type="spellStart"/>
       <w:r>
         <w:rPr>
           <w:rFonts w:ascii="Courier New" w:eastAsia="Courier New" w:hAnsi="Courier New" w:cs="Courier New"/>
           <w:sz w:val="20"/>
           <w:szCs w:val="20"/>
         </w:rPr>
-        <w:t>app.visual.nome</w:t>
-      </w:r>
-      <w:proofErr w:type="spellEnd"/>
+        <w:t>app.visual.nome=Login Seguro</w:t>
+      </w:r>
+    </w:p>
+    <w:p>
+      <w:pPr>
+        <w:keepLines/>
+        <w:shd w:val="clear" w:color="auto" w:fill="F2F2F2"/>
+        <w:spacing w:after="240" w:line="240" w:lineRule="auto"/>
+        <w:ind w:left="709"/>
+      </w:pPr>
       <w:r>
         <w:rPr>
           <w:rFonts w:ascii="Courier New" w:eastAsia="Courier New" w:hAnsi="Courier New" w:cs="Courier New"/>
           <w:sz w:val="20"/>
           <w:szCs w:val="20"/>
         </w:rPr>
-        <w:t>=Login Seguro</w:t>
-      </w:r>
-    </w:p>
-    <w:p>
-      <w:pPr>
-        <w:keepLines/>
-        <w:shd w:val="clear" w:color="auto" w:fill="F2F2F2"/>
-        <w:spacing w:after="240" w:line="240" w:lineRule="auto"/>
-        <w:ind w:left="709"/>
-      </w:pPr>
-      <w:proofErr w:type="spellStart"/>
-      <w:r>
-        <w:rPr>
-          <w:rFonts w:ascii="Courier New" w:eastAsia="Courier New" w:hAnsi="Courier New" w:cs="Courier New"/>
-          <w:sz w:val="20"/>
-          <w:szCs w:val="20"/>
-        </w:rPr>
-        <w:t>app.visual.tema</w:t>
-      </w:r>
-      <w:proofErr w:type="spellEnd"/>
-      <w:r>
-        <w:rPr>
-          <w:rFonts w:ascii="Courier New" w:eastAsia="Courier New" w:hAnsi="Courier New" w:cs="Courier New"/>
-          <w:sz w:val="20"/>
-          <w:szCs w:val="20"/>
-        </w:rPr>
-        <w:t>=</w:t>
-      </w:r>
-      <w:proofErr w:type="spellStart"/>
-      <w:r>
-        <w:rPr>
-          <w:rFonts w:ascii="Courier New" w:eastAsia="Courier New" w:hAnsi="Courier New" w:cs="Courier New"/>
-          <w:sz w:val="20"/>
-          <w:szCs w:val="20"/>
-        </w:rPr>
-        <w:t>padrao</w:t>
-      </w:r>
-      <w:proofErr w:type="spellEnd"/>
+        <w:t>app.visual.tema=padrao</w:t>
+      </w:r>
     </w:p>
     <w:p>
       <w:pPr>
@@ -5195,47 +4217,7 @@
         <w:jc w:val="both"/>
       </w:pPr>
       <w:r>
-        <w:t xml:space="preserve">No </w:t>
-      </w:r>
-      <w:proofErr w:type="spellStart"/>
-      <w:r>
-        <w:t>IntelliJ</w:t>
-      </w:r>
-      <w:proofErr w:type="spellEnd"/>
-      <w:r>
-        <w:t xml:space="preserve">, a variável é cadastrada nas configurações de execução da classe </w:t>
-      </w:r>
-      <w:proofErr w:type="spellStart"/>
-      <w:r>
-        <w:t>LoginSeguroApplication</w:t>
-      </w:r>
-      <w:proofErr w:type="spellEnd"/>
-      <w:r>
-        <w:t xml:space="preserve">. No terminal do Windows, ela pode ser definida na sessão do </w:t>
-      </w:r>
-      <w:proofErr w:type="spellStart"/>
-      <w:r>
-        <w:t>PowerShell</w:t>
-      </w:r>
-      <w:proofErr w:type="spellEnd"/>
-      <w:r>
-        <w:t xml:space="preserve"> antes de rodar o </w:t>
-      </w:r>
-      <w:proofErr w:type="spellStart"/>
-      <w:r>
-        <w:t>Maven</w:t>
-      </w:r>
-      <w:proofErr w:type="spellEnd"/>
-      <w:r>
-        <w:t xml:space="preserve"> </w:t>
-      </w:r>
-      <w:proofErr w:type="spellStart"/>
-      <w:r>
-        <w:t>Wrapper</w:t>
-      </w:r>
-      <w:proofErr w:type="spellEnd"/>
-      <w:r>
-        <w:t>. Se o usuário ou a senha do banco tiverem caracteres especiais, eles precisam ser codificados para uso na URI. O README do repositório descreve os dois procedimentos.</w:t>
+        <w:t>No IntelliJ, a variável é cadastrada nas configurações de execução da classe LoginSeguroApplication. No terminal do Windows, ela pode ser definida na sessão do PowerShell antes de rodar o Maven Wrapper. Se o usuário ou a senha do banco tiverem caracteres especiais, eles precisam ser codificados para uso na URI. O README do repositório descreve os dois procedimentos.</w:t>
       </w:r>
     </w:p>
     <w:p>
@@ -5256,15 +4238,7 @@
         <w:jc w:val="both"/>
       </w:pPr>
       <w:r>
-        <w:t xml:space="preserve">O banco se chama </w:t>
-      </w:r>
-      <w:proofErr w:type="spellStart"/>
-      <w:r>
-        <w:t>login_seguro</w:t>
-      </w:r>
-      <w:proofErr w:type="spellEnd"/>
-      <w:r>
-        <w:t xml:space="preserve"> e tem as coleções do quadro 4.</w:t>
+        <w:t>O banco se chama login_seguro e tem as coleções do quadro 4.</w:t>
       </w:r>
     </w:p>
     <w:p>
@@ -5278,17 +4252,8 @@
           <w:sz w:val="20"/>
           <w:szCs w:val="20"/>
         </w:rPr>
-        <w:t xml:space="preserve">Quadro 4 – Coleções do banco </w:t>
-      </w:r>
-      <w:proofErr w:type="spellStart"/>
-      <w:r>
-        <w:rPr>
-          <w:sz w:val="20"/>
-          <w:szCs w:val="20"/>
-        </w:rPr>
-        <w:t>login_seguro</w:t>
-      </w:r>
-      <w:proofErr w:type="spellEnd"/>
+        <w:t>Quadro 4 – Coleções do banco login_seguro</w:t>
+      </w:r>
     </w:p>
     <w:tbl>
       <w:tblPr>
@@ -5421,7 +4386,6 @@
               <w:keepLines/>
               <w:spacing w:after="40" w:line="240" w:lineRule="auto"/>
             </w:pPr>
-            <w:proofErr w:type="spellStart"/>
             <w:r>
               <w:rPr>
                 <w:b/>
@@ -5431,7 +4395,6 @@
               </w:rPr>
               <w:t>usuarios</w:t>
             </w:r>
-            <w:proofErr w:type="spellEnd"/>
           </w:p>
         </w:tc>
         <w:tc>
@@ -5455,39 +4418,7 @@
                 <w:sz w:val="20"/>
                 <w:szCs w:val="20"/>
               </w:rPr>
-              <w:t xml:space="preserve">Um documento por usuário, com _id, nome, </w:t>
-            </w:r>
-            <w:proofErr w:type="spellStart"/>
-            <w:r>
-              <w:rPr>
-                <w:sz w:val="20"/>
-                <w:szCs w:val="20"/>
-              </w:rPr>
-              <w:t>email</w:t>
-            </w:r>
-            <w:proofErr w:type="spellEnd"/>
-            <w:r>
-              <w:rPr>
-                <w:sz w:val="20"/>
-                <w:szCs w:val="20"/>
-              </w:rPr>
-              <w:t xml:space="preserve">, </w:t>
-            </w:r>
-            <w:proofErr w:type="spellStart"/>
-            <w:r>
-              <w:rPr>
-                <w:sz w:val="20"/>
-                <w:szCs w:val="20"/>
-              </w:rPr>
-              <w:t>senhaHash</w:t>
-            </w:r>
-            <w:proofErr w:type="spellEnd"/>
-            <w:r>
-              <w:rPr>
-                <w:sz w:val="20"/>
-                <w:szCs w:val="20"/>
-              </w:rPr>
-              <w:t xml:space="preserve"> e perfil.</w:t>
+              <w:t>Um documento por usuário, com _id, nome, email, senhaHash e perfil.</w:t>
             </w:r>
           </w:p>
         </w:tc>
@@ -5507,31 +4438,13 @@
               <w:keepLines/>
               <w:spacing w:after="40" w:line="240" w:lineRule="auto"/>
             </w:pPr>
-            <w:proofErr w:type="spellStart"/>
-            <w:r>
-              <w:rPr>
-                <w:sz w:val="20"/>
-                <w:szCs w:val="20"/>
-              </w:rPr>
-              <w:t>UsuarioEntity</w:t>
-            </w:r>
-            <w:proofErr w:type="spellEnd"/>
-            <w:r>
-              <w:rPr>
-                <w:sz w:val="20"/>
-                <w:szCs w:val="20"/>
-              </w:rPr>
-              <w:t xml:space="preserve"> e </w:t>
-            </w:r>
-            <w:proofErr w:type="spellStart"/>
-            <w:r>
-              <w:rPr>
-                <w:sz w:val="20"/>
-                <w:szCs w:val="20"/>
-              </w:rPr>
-              <w:t>IUsuarioRepository</w:t>
-            </w:r>
-            <w:proofErr w:type="spellEnd"/>
+            <w:r>
+              <w:rPr>
+                <w:sz w:val="20"/>
+                <w:szCs w:val="20"/>
+              </w:rPr>
+              <w:t>UsuarioEntity e IUsuarioRepository</w:t>
+            </w:r>
           </w:p>
         </w:tc>
       </w:tr>
@@ -5555,7 +4468,6 @@
               <w:keepLines/>
               <w:spacing w:after="40" w:line="240" w:lineRule="auto"/>
             </w:pPr>
-            <w:proofErr w:type="spellStart"/>
             <w:r>
               <w:rPr>
                 <w:b/>
@@ -5565,7 +4477,6 @@
               </w:rPr>
               <w:t>sessoes</w:t>
             </w:r>
-            <w:proofErr w:type="spellEnd"/>
           </w:p>
         </w:tc>
         <w:tc>
@@ -5609,21 +4520,12 @@
               <w:keepLines/>
               <w:spacing w:after="40" w:line="240" w:lineRule="auto"/>
             </w:pPr>
-            <w:proofErr w:type="spellStart"/>
-            <w:r>
-              <w:rPr>
-                <w:sz w:val="20"/>
-                <w:szCs w:val="20"/>
-              </w:rPr>
-              <w:t>SessaoConfig</w:t>
-            </w:r>
-            <w:proofErr w:type="spellEnd"/>
-            <w:r>
-              <w:rPr>
-                <w:sz w:val="20"/>
-                <w:szCs w:val="20"/>
-              </w:rPr>
-              <w:t xml:space="preserve"> (@EnableMongoHttpSession)</w:t>
+            <w:r>
+              <w:rPr>
+                <w:sz w:val="20"/>
+                <w:szCs w:val="20"/>
+              </w:rPr>
+              <w:t>SessaoConfig (@EnableMongoHttpSession)</w:t>
             </w:r>
           </w:p>
         </w:tc>
@@ -5647,47 +4549,7 @@
         <w:jc w:val="both"/>
       </w:pPr>
       <w:r>
-        <w:t xml:space="preserve">O campo </w:t>
-      </w:r>
-      <w:proofErr w:type="spellStart"/>
-      <w:r>
-        <w:t>email</w:t>
-      </w:r>
-      <w:proofErr w:type="spellEnd"/>
-      <w:r>
-        <w:t xml:space="preserve"> da entidade tem a anotação @Indexed(unique = </w:t>
-      </w:r>
-      <w:proofErr w:type="spellStart"/>
-      <w:r>
-        <w:t>true</w:t>
-      </w:r>
-      <w:proofErr w:type="spellEnd"/>
-      <w:r>
-        <w:t xml:space="preserve">), e a propriedade </w:t>
-      </w:r>
-      <w:proofErr w:type="spellStart"/>
-      <w:r>
-        <w:t>spring.data.mongodb.auto</w:t>
-      </w:r>
-      <w:proofErr w:type="spellEnd"/>
-      <w:r>
-        <w:t>-index-</w:t>
-      </w:r>
-      <w:proofErr w:type="spellStart"/>
-      <w:r>
-        <w:t>creation</w:t>
-      </w:r>
-      <w:proofErr w:type="spellEnd"/>
-      <w:r>
-        <w:t>=</w:t>
-      </w:r>
-      <w:proofErr w:type="spellStart"/>
-      <w:r>
-        <w:t>true</w:t>
-      </w:r>
-      <w:proofErr w:type="spellEnd"/>
-      <w:r>
-        <w:t xml:space="preserve"> faz o Spring criar esse índice único quando a aplicação sobe. A verificação no serviço mostra uma mensagem clara ao usuário, e o índice garante a regra no próprio banco.</w:t>
+        <w:t>O campo email da entidade tem a anotação @Indexed(unique = true), e a propriedade spring.data.mongodb.auto-index-creation=true faz o Spring criar esse índice único quando a aplicação sobe. A verificação no serviço mostra uma mensagem clara ao usuário, e o índice garante a regra no próprio banco.</w:t>
       </w:r>
     </w:p>
     <w:p>
@@ -5706,15 +4568,7 @@
         <w:jc w:val="both"/>
       </w:pPr>
       <w:r>
-        <w:t xml:space="preserve">A URI do tipo </w:t>
-      </w:r>
-      <w:proofErr w:type="spellStart"/>
-      <w:r>
-        <w:t>mongodb+srv</w:t>
-      </w:r>
-      <w:proofErr w:type="spellEnd"/>
-      <w:r>
-        <w:t xml:space="preserve"> fornecida pelo Atlas usa TLS por padrão. Os dados trafegam criptografados entre a aplicação e o cluster, e a validação do certificado continua habilitada.</w:t>
+        <w:t>A URI do tipo mongodb+srv fornecida pelo Atlas usa TLS por padrão. Os dados trafegam criptografados entre a aplicação e o cluster, e a validação do certificado continua habilitada.</w:t>
       </w:r>
     </w:p>
     <w:p>
@@ -5723,15 +4577,7 @@
         <w:jc w:val="both"/>
       </w:pPr>
       <w:r>
-        <w:t xml:space="preserve">A aplicação deve se conectar com um usuário de banco próprio, com permissão de leitura e escrita apenas no banco </w:t>
-      </w:r>
-      <w:proofErr w:type="spellStart"/>
-      <w:r>
-        <w:t>login_seguro</w:t>
-      </w:r>
-      <w:proofErr w:type="spellEnd"/>
-      <w:r>
-        <w:t>, e não com a conta de administração do Atlas. Assim, se essa senha vazar, o acesso fica limitado a esse banco.</w:t>
+        <w:t>A aplicação deve se conectar com um usuário de banco próprio, com permissão de leitura e escrita apenas no banco login_seguro, e não com a conta de administração do Atlas. Assim, se essa senha vazar, o acesso fica limitado a esse banco.</w:t>
       </w:r>
     </w:p>
     <w:p>
@@ -5788,23 +4634,7 @@
         <w:jc w:val="both"/>
       </w:pPr>
       <w:r>
-        <w:t xml:space="preserve">c) no Atlas, abrir o banco </w:t>
-      </w:r>
-      <w:proofErr w:type="spellStart"/>
-      <w:r>
-        <w:t>login_seguro</w:t>
-      </w:r>
-      <w:proofErr w:type="spellEnd"/>
-      <w:r>
-        <w:t xml:space="preserve"> e a coleção </w:t>
-      </w:r>
-      <w:proofErr w:type="spellStart"/>
-      <w:r>
-        <w:t>usuarios</w:t>
-      </w:r>
-      <w:proofErr w:type="spellEnd"/>
-      <w:r>
-        <w:t>;</w:t>
+        <w:t>c) no Atlas, abrir o banco login_seguro e a coleção usuarios;</w:t>
       </w:r>
     </w:p>
     <w:p>
@@ -5872,31 +4702,7 @@
         <w:jc w:val="both"/>
       </w:pPr>
       <w:r>
-        <w:t xml:space="preserve">O nome e o tema ficam no </w:t>
-      </w:r>
-      <w:proofErr w:type="spellStart"/>
-      <w:r>
-        <w:t>application.properties</w:t>
-      </w:r>
-      <w:proofErr w:type="spellEnd"/>
-      <w:r>
-        <w:t xml:space="preserve">, nas propriedades com prefixo </w:t>
-      </w:r>
-      <w:proofErr w:type="spellStart"/>
-      <w:r>
-        <w:t>app.visual</w:t>
-      </w:r>
-      <w:proofErr w:type="spellEnd"/>
-      <w:r>
-        <w:t xml:space="preserve">, lidas pela classe </w:t>
-      </w:r>
-      <w:proofErr w:type="spellStart"/>
-      <w:r>
-        <w:t>TemaConfig</w:t>
-      </w:r>
-      <w:proofErr w:type="spellEnd"/>
-      <w:r>
-        <w:t>:</w:t>
+        <w:t>O nome e o tema ficam no application.properties, nas propriedades com prefixo app.visual, lidas pela classe TemaConfig:</w:t>
       </w:r>
     </w:p>
     <w:p>
@@ -5907,49 +4713,29 @@
         <w:spacing w:before="120" w:line="240" w:lineRule="auto"/>
         <w:ind w:left="709"/>
       </w:pPr>
-      <w:proofErr w:type="spellStart"/>
       <w:r>
         <w:rPr>
           <w:rFonts w:ascii="Courier New" w:eastAsia="Courier New" w:hAnsi="Courier New" w:cs="Courier New"/>
           <w:sz w:val="20"/>
           <w:szCs w:val="20"/>
         </w:rPr>
-        <w:t>app.visual.nome</w:t>
-      </w:r>
-      <w:proofErr w:type="spellEnd"/>
+        <w:t>app.visual.nome=Login Seguro</w:t>
+      </w:r>
+    </w:p>
+    <w:p>
+      <w:pPr>
+        <w:keepLines/>
+        <w:shd w:val="clear" w:color="auto" w:fill="F2F2F2"/>
+        <w:spacing w:after="240" w:line="240" w:lineRule="auto"/>
+        <w:ind w:left="709"/>
+      </w:pPr>
       <w:r>
         <w:rPr>
           <w:rFonts w:ascii="Courier New" w:eastAsia="Courier New" w:hAnsi="Courier New" w:cs="Courier New"/>
           <w:sz w:val="20"/>
           <w:szCs w:val="20"/>
         </w:rPr>
-        <w:t>=Login Seguro</w:t>
-      </w:r>
-    </w:p>
-    <w:p>
-      <w:pPr>
-        <w:keepLines/>
-        <w:shd w:val="clear" w:color="auto" w:fill="F2F2F2"/>
-        <w:spacing w:after="240" w:line="240" w:lineRule="auto"/>
-        <w:ind w:left="709"/>
-      </w:pPr>
-      <w:proofErr w:type="spellStart"/>
-      <w:r>
-        <w:rPr>
-          <w:rFonts w:ascii="Courier New" w:eastAsia="Courier New" w:hAnsi="Courier New" w:cs="Courier New"/>
-          <w:sz w:val="20"/>
-          <w:szCs w:val="20"/>
-        </w:rPr>
-        <w:t>app.visual.tema</w:t>
-      </w:r>
-      <w:proofErr w:type="spellEnd"/>
-      <w:r>
-        <w:rPr>
-          <w:rFonts w:ascii="Courier New" w:eastAsia="Courier New" w:hAnsi="Courier New" w:cs="Courier New"/>
-          <w:sz w:val="20"/>
-          <w:szCs w:val="20"/>
-        </w:rPr>
-        <w:t>=verde</w:t>
+        <w:t>app.visual.tema=verde</w:t>
       </w:r>
     </w:p>
     <w:p>
@@ -5958,55 +4744,7 @@
         <w:jc w:val="both"/>
       </w:pPr>
       <w:r>
-        <w:t xml:space="preserve">O valor de </w:t>
-      </w:r>
-      <w:proofErr w:type="spellStart"/>
-      <w:r>
-        <w:t>app.visual.nome</w:t>
-      </w:r>
-      <w:proofErr w:type="spellEnd"/>
-      <w:r>
-        <w:t xml:space="preserve"> aparece no título da aba, no cabeçalho e no rodapé de todas as páginas. O valor de </w:t>
-      </w:r>
-      <w:proofErr w:type="spellStart"/>
-      <w:r>
-        <w:t>app.visual.tema</w:t>
-      </w:r>
-      <w:proofErr w:type="spellEnd"/>
-      <w:r>
-        <w:t xml:space="preserve"> escolhe qual arquivo da pasta </w:t>
-      </w:r>
-      <w:proofErr w:type="spellStart"/>
-      <w:r>
-        <w:t>static</w:t>
-      </w:r>
-      <w:proofErr w:type="spellEnd"/>
-      <w:r>
-        <w:t>/</w:t>
-      </w:r>
-      <w:proofErr w:type="spellStart"/>
-      <w:r>
-        <w:t>css</w:t>
-      </w:r>
-      <w:proofErr w:type="spellEnd"/>
-      <w:r>
-        <w:t xml:space="preserve">/temas é carregado. Hoje existem padrao.css e verde.css. O </w:t>
-      </w:r>
-      <w:proofErr w:type="spellStart"/>
-      <w:r>
-        <w:t>TemaControllerAdvice</w:t>
-      </w:r>
-      <w:proofErr w:type="spellEnd"/>
-      <w:r>
-        <w:t xml:space="preserve"> entrega essas propriedades a todas as páginas com o nome visual, então nenhum </w:t>
-      </w:r>
-      <w:proofErr w:type="spellStart"/>
-      <w:r>
-        <w:t>controller</w:t>
-      </w:r>
-      <w:proofErr w:type="spellEnd"/>
-      <w:r>
-        <w:t xml:space="preserve"> precisa repassá-las. Depois de trocar os valores, basta reiniciar a aplicação, sem mudar nenhuma classe Java.</w:t>
+        <w:t>O valor de app.visual.nome aparece no título da aba, no cabeçalho e no rodapé de todas as páginas. O valor de app.visual.tema escolhe qual arquivo da pasta static/css/temas é carregado. Hoje existem padrao.css e verde.css. O TemaControllerAdvice entrega essas propriedades a todas as páginas com o nome visual, então nenhum controller precisa repassá-las. Depois de trocar os valores, basta reiniciar a aplicação, sem mudar nenhuma classe Java.</w:t>
       </w:r>
     </w:p>
     <w:p>
@@ -6015,15 +4753,7 @@
         <w:jc w:val="both"/>
       </w:pPr>
       <w:r>
-        <w:t xml:space="preserve">O nome do tema só aceita letras minúsculas, números e hífen. A </w:t>
-      </w:r>
-      <w:proofErr w:type="spellStart"/>
-      <w:r>
-        <w:t>TemaConfig</w:t>
-      </w:r>
-      <w:proofErr w:type="spellEnd"/>
-      <w:r>
-        <w:t xml:space="preserve"> valida isso na inicialização, e um valor fora desse padrão impede a aplicação de subir. O sistema não confere se o arquivo CSS existe: se o nome estiver no formato certo mas o arquivo faltar, as páginas abrem sem as cores do tema.</w:t>
+        <w:t>O nome do tema só aceita letras minúsculas, números e hífen. A TemaConfig valida isso na inicialização, e um valor fora desse padrão impede a aplicação de subir. O sistema não confere se o arquivo CSS existe: se o nome estiver no formato certo mas o arquivo faltar, as páginas abrem sem as cores do tema.</w:t>
       </w:r>
     </w:p>
     <w:p>
@@ -6049,31 +4779,7 @@
         <w:jc w:val="both"/>
       </w:pPr>
       <w:r>
-        <w:t xml:space="preserve">Para criar um tema, copio um dos arquivos da pasta </w:t>
-      </w:r>
-      <w:proofErr w:type="spellStart"/>
-      <w:r>
-        <w:t>static</w:t>
-      </w:r>
-      <w:proofErr w:type="spellEnd"/>
-      <w:r>
-        <w:t>/</w:t>
-      </w:r>
-      <w:proofErr w:type="spellStart"/>
-      <w:r>
-        <w:t>css</w:t>
-      </w:r>
-      <w:proofErr w:type="spellEnd"/>
-      <w:r>
-        <w:t xml:space="preserve">/temas com outro nome, por exemplo azul-escuro.css, troco as três variáveis de cor e configuro </w:t>
-      </w:r>
-      <w:proofErr w:type="spellStart"/>
-      <w:r>
-        <w:t>app.visual.tema</w:t>
-      </w:r>
-      <w:proofErr w:type="spellEnd"/>
-      <w:r>
-        <w:t>=azul-escuro, sem a extensão:</w:t>
+        <w:t>Para criar um tema, copio um dos arquivos da pasta static/css/temas com outro nome, por exemplo azul-escuro.css, troco as três variáveis de cor e configuro app.visual.tema=azul-escuro, sem a extensão:</w:t>
       </w:r>
     </w:p>
     <w:p>
@@ -6186,71 +4892,7 @@
         <w:jc w:val="both"/>
       </w:pPr>
       <w:r>
-        <w:t xml:space="preserve">O arquivo </w:t>
-      </w:r>
-      <w:proofErr w:type="spellStart"/>
-      <w:r>
-        <w:t>templates</w:t>
-      </w:r>
-      <w:proofErr w:type="spellEnd"/>
-      <w:r>
-        <w:t xml:space="preserve">/fragmentos/layout.html define três fragmentos: </w:t>
-      </w:r>
-      <w:proofErr w:type="spellStart"/>
-      <w:r>
-        <w:t>head</w:t>
-      </w:r>
-      <w:proofErr w:type="spellEnd"/>
-      <w:r>
-        <w:t xml:space="preserve">(titulo), que carrega as folhas de estilo; </w:t>
-      </w:r>
-      <w:proofErr w:type="spellStart"/>
-      <w:r>
-        <w:t>cabecalho</w:t>
-      </w:r>
-      <w:proofErr w:type="spellEnd"/>
-      <w:r>
-        <w:t xml:space="preserve">, com a marca, a imagem e o menu; e </w:t>
-      </w:r>
-      <w:proofErr w:type="spellStart"/>
-      <w:r>
-        <w:t>rodape</w:t>
-      </w:r>
-      <w:proofErr w:type="spellEnd"/>
-      <w:r>
-        <w:t xml:space="preserve">. Cada página chama esses fragmentos com </w:t>
-      </w:r>
-      <w:proofErr w:type="spellStart"/>
-      <w:r>
-        <w:t>th:replace</w:t>
-      </w:r>
-      <w:proofErr w:type="spellEnd"/>
-      <w:r>
-        <w:t xml:space="preserve">. Trocar o logotipo, acrescentar um item no menu ou mudar o rodapé é uma alteração nesse único arquivo. A imagem do cabeçalho fica em </w:t>
-      </w:r>
-      <w:proofErr w:type="spellStart"/>
-      <w:r>
-        <w:t>static</w:t>
-      </w:r>
-      <w:proofErr w:type="spellEnd"/>
-      <w:r>
-        <w:t xml:space="preserve">/imagens e é referenciada no fragmento </w:t>
-      </w:r>
-      <w:proofErr w:type="spellStart"/>
-      <w:r>
-        <w:t>cabecalho</w:t>
-      </w:r>
-      <w:proofErr w:type="spellEnd"/>
-      <w:r>
-        <w:t xml:space="preserve">. Os links do menu usam </w:t>
-      </w:r>
-      <w:proofErr w:type="spellStart"/>
-      <w:r>
-        <w:t>sec:authorize</w:t>
-      </w:r>
-      <w:proofErr w:type="spellEnd"/>
-      <w:r>
-        <w:t>, então um item novo pode aparecer só para os perfis certos.</w:t>
+        <w:t>O arquivo templates/fragmentos/layout.html define três fragmentos: head(titulo), que carrega as folhas de estilo; cabecalho, com a marca, a imagem e o menu; e rodape. Cada página chama esses fragmentos com th:replace. Trocar o logotipo, acrescentar um item no menu ou mudar o rodapé é uma alteração nesse único arquivo. A imagem do cabeçalho fica em static/imagens e é referenciada no fragmento cabecalho. Os links do menu usam sec:authorize, então um item novo pode aparecer só para os perfis certos.</w:t>
       </w:r>
     </w:p>
     <w:p>
@@ -6279,15 +4921,7 @@
         <w:jc w:val="both"/>
       </w:pPr>
       <w:r>
-        <w:t xml:space="preserve">a) criar a página em </w:t>
-      </w:r>
-      <w:proofErr w:type="spellStart"/>
-      <w:r>
-        <w:t>templates</w:t>
-      </w:r>
-      <w:proofErr w:type="spellEnd"/>
-      <w:r>
-        <w:t>, usando os fragmentos de layout.html;</w:t>
+        <w:t>a) criar a página em templates, usando os fragmentos de layout.html;</w:t>
       </w:r>
     </w:p>
     <w:p>
@@ -6296,15 +4930,7 @@
         <w:jc w:val="both"/>
       </w:pPr>
       <w:r>
-        <w:t xml:space="preserve">b) criar ou ampliar um </w:t>
-      </w:r>
-      <w:proofErr w:type="spellStart"/>
-      <w:r>
-        <w:t>controller</w:t>
-      </w:r>
-      <w:proofErr w:type="spellEnd"/>
-      <w:r>
-        <w:t xml:space="preserve"> com a rota, sem colocar regra de negócio nele;</w:t>
+        <w:t>b) criar ou ampliar um controller com a rota, sem colocar regra de negócio nele;</w:t>
       </w:r>
     </w:p>
     <w:p>
@@ -6313,23 +4939,7 @@
         <w:jc w:val="both"/>
       </w:pPr>
       <w:r>
-        <w:t xml:space="preserve">c) declarar o método na interface do pacote </w:t>
-      </w:r>
-      <w:proofErr w:type="spellStart"/>
-      <w:r>
-        <w:t>service</w:t>
-      </w:r>
-      <w:proofErr w:type="spellEnd"/>
-      <w:r>
-        <w:t xml:space="preserve"> e implementar as regras em </w:t>
-      </w:r>
-      <w:proofErr w:type="spellStart"/>
-      <w:r>
-        <w:t>service.impl</w:t>
-      </w:r>
-      <w:proofErr w:type="spellEnd"/>
-      <w:r>
-        <w:t>;</w:t>
+        <w:t>c) declarar o método na interface do pacote service e implementar as regras em service.impl;</w:t>
       </w:r>
     </w:p>
     <w:p>
@@ -6338,23 +4948,7 @@
         <w:jc w:val="both"/>
       </w:pPr>
       <w:r>
-        <w:t xml:space="preserve">d) se houver dados novos, criar a entidade, o repositório, os </w:t>
-      </w:r>
-      <w:proofErr w:type="spellStart"/>
-      <w:r>
-        <w:t>DTOs</w:t>
-      </w:r>
-      <w:proofErr w:type="spellEnd"/>
-      <w:r>
-        <w:t xml:space="preserve"> e o </w:t>
-      </w:r>
-      <w:proofErr w:type="spellStart"/>
-      <w:r>
-        <w:t>mapper</w:t>
-      </w:r>
-      <w:proofErr w:type="spellEnd"/>
-      <w:r>
-        <w:t xml:space="preserve"> correspondentes;</w:t>
+        <w:t>d) se houver dados novos, criar a entidade, o repositório, os DTOs e o mapper correspondentes;</w:t>
       </w:r>
     </w:p>
     <w:p>
@@ -6363,23 +4957,7 @@
         <w:jc w:val="both"/>
       </w:pPr>
       <w:r>
-        <w:t xml:space="preserve">e) liberar a rota na </w:t>
-      </w:r>
-      <w:proofErr w:type="spellStart"/>
-      <w:r>
-        <w:t>SecurityConfig</w:t>
-      </w:r>
-      <w:proofErr w:type="spellEnd"/>
-      <w:r>
-        <w:t xml:space="preserve">, no bloco </w:t>
-      </w:r>
-      <w:proofErr w:type="spellStart"/>
-      <w:r>
-        <w:t>authorizeHttpRequests</w:t>
-      </w:r>
-      <w:proofErr w:type="spellEnd"/>
-      <w:r>
-        <w:t>, indicando quais perfis podem acessá-la;</w:t>
+        <w:t>e) liberar a rota na SecurityConfig, no bloco authorizeHttpRequests, indicando quais perfis podem acessá-la;</w:t>
       </w:r>
     </w:p>
     <w:p>
@@ -6388,23 +4966,7 @@
         <w:jc w:val="both"/>
       </w:pPr>
       <w:r>
-        <w:t xml:space="preserve">f) se a página tiver link no menu, acrescentá-lo no fragmento </w:t>
-      </w:r>
-      <w:proofErr w:type="spellStart"/>
-      <w:r>
-        <w:t>cabecalho</w:t>
-      </w:r>
-      <w:proofErr w:type="spellEnd"/>
-      <w:r>
-        <w:t xml:space="preserve"> com </w:t>
-      </w:r>
-      <w:proofErr w:type="spellStart"/>
-      <w:r>
-        <w:t>sec:authorize</w:t>
-      </w:r>
-      <w:proofErr w:type="spellEnd"/>
-      <w:r>
-        <w:t>.</w:t>
+        <w:t>f) se a página tiver link no menu, acrescentá-lo no fragmento cabecalho com sec:authorize.</w:t>
       </w:r>
     </w:p>
     <w:p>
@@ -6413,23 +4975,7 @@
         <w:jc w:val="both"/>
       </w:pPr>
       <w:r>
-        <w:t xml:space="preserve">Se o PFC precisar de outros perfis, eles entram na enumeração </w:t>
-      </w:r>
-      <w:proofErr w:type="spellStart"/>
-      <w:r>
-        <w:t>PerfilEnum</w:t>
-      </w:r>
-      <w:proofErr w:type="spellEnd"/>
-      <w:r>
-        <w:t xml:space="preserve"> e nas regras da </w:t>
-      </w:r>
-      <w:proofErr w:type="spellStart"/>
-      <w:r>
-        <w:t>SecurityConfig</w:t>
-      </w:r>
-      <w:proofErr w:type="spellEnd"/>
-      <w:r>
-        <w:t>. Como os nomes atuais são genéricos, também dá para manter os três níveis e mudar só o texto exibido nas páginas.</w:t>
+        <w:t>Se o PFC precisar de outros perfis, eles entram na enumeração PerfilEnum e nas regras da SecurityConfig. Como os nomes atuais são genéricos, também dá para manter os três níveis e mudar só o texto exibido nas páginas.</w:t>
       </w:r>
     </w:p>
     <w:p>
@@ -6450,23 +4996,7 @@
         <w:jc w:val="both"/>
       </w:pPr>
       <w:r>
-        <w:t xml:space="preserve">Segundo </w:t>
-      </w:r>
-      <w:proofErr w:type="spellStart"/>
-      <w:r>
-        <w:t>Sommerville</w:t>
-      </w:r>
-      <w:proofErr w:type="spellEnd"/>
-      <w:r>
-        <w:t xml:space="preserve"> (2011, p. 59), os requisitos funcionais descrevem os serviços que o sistema oferece e como ele se comporta diante de entradas e situações específicas. Os requisitos não funcionais foram classificados, como propõe o mesmo autor (</w:t>
-      </w:r>
-      <w:proofErr w:type="spellStart"/>
-      <w:r>
-        <w:t>Sommerville</w:t>
-      </w:r>
-      <w:proofErr w:type="spellEnd"/>
-      <w:r>
-        <w:t>, 2011, p. 61), em requisitos de produto, organizacionais e externos. Esta seção apresenta os atores, os requisitos com a situação de cada um e as regras de negócio.</w:t>
+        <w:t>Segundo Sommerville (2011, p. 59), os requisitos funcionais descrevem os serviços que o sistema oferece e como ele se comporta diante de entradas e situações específicas. Os requisitos não funcionais foram classificados, como propõe o mesmo autor (Sommerville, 2011, p. 61), em requisitos de produto, organizacionais e externos. Esta seção apresenta os atores, os requisitos com a situação de cada um e as regras de negócio.</w:t>
       </w:r>
     </w:p>
     <w:p>
@@ -6879,15 +5409,7 @@
         <w:jc w:val="both"/>
       </w:pPr>
       <w:r>
-        <w:t xml:space="preserve">Separar os perfis segue o princípio apresentado por </w:t>
-      </w:r>
-      <w:proofErr w:type="spellStart"/>
-      <w:r>
-        <w:t>Sommerville</w:t>
-      </w:r>
-      <w:proofErr w:type="spellEnd"/>
-      <w:r>
-        <w:t xml:space="preserve"> (2011, p. 267) de dar a cada usuário só o acesso de que ele precisa, o que diminui o estrago de uma conta comprometida. O servidor confere as permissões em toda requisição. O cabeçalho só esconde os links que o perfil não pode usar, e quem digita a URL direto continua barrado. O quadro 6 mostra o que cada perfil acessa.</w:t>
+        <w:t>Separar os perfis segue o princípio apresentado por Sommerville (2011, p. 267) de dar a cada usuário só o acesso de que ele precisa, o que diminui o estrago de uma conta comprometida. O servidor confere as permissões em toda requisição. O cabeçalho só esconde os links que o perfil não pode usar, e quem digita a URL direto continua barrado. O quadro 6 mostra o que cada perfil acessa.</w:t>
       </w:r>
     </w:p>
     <w:p>
@@ -7490,23 +6012,7 @@
                 <w:sz w:val="20"/>
                 <w:szCs w:val="20"/>
               </w:rPr>
-              <w:t>Administração e lista de usuários (/admin, /admin/</w:t>
-            </w:r>
-            <w:proofErr w:type="spellStart"/>
-            <w:r>
-              <w:rPr>
-                <w:sz w:val="20"/>
-                <w:szCs w:val="20"/>
-              </w:rPr>
-              <w:t>usuarios</w:t>
-            </w:r>
-            <w:proofErr w:type="spellEnd"/>
-            <w:r>
-              <w:rPr>
-                <w:sz w:val="20"/>
-                <w:szCs w:val="20"/>
-              </w:rPr>
-              <w:t>)</w:t>
+              <w:t>Administração e lista de usuários (/admin, /admin/usuarios)</w:t>
             </w:r>
           </w:p>
         </w:tc>
@@ -7636,23 +6142,7 @@
                 <w:sz w:val="20"/>
                 <w:szCs w:val="20"/>
               </w:rPr>
-              <w:t>Editar e excluir usuários (/admin/</w:t>
-            </w:r>
-            <w:proofErr w:type="spellStart"/>
-            <w:r>
-              <w:rPr>
-                <w:sz w:val="20"/>
-                <w:szCs w:val="20"/>
-              </w:rPr>
-              <w:t>usuarios</w:t>
-            </w:r>
-            <w:proofErr w:type="spellEnd"/>
-            <w:r>
-              <w:rPr>
-                <w:sz w:val="20"/>
-                <w:szCs w:val="20"/>
-              </w:rPr>
-              <w:t>/{id}/editar e /excluir)</w:t>
+              <w:t>Editar e excluir usuários (/admin/usuarios/{id}/editar e /excluir)</w:t>
             </w:r>
           </w:p>
         </w:tc>
@@ -8867,33 +7357,8 @@
                 <w:sz w:val="20"/>
                 <w:szCs w:val="20"/>
               </w:rPr>
-              <w:t xml:space="preserve">Senhas só como </w:t>
-            </w:r>
-            <w:proofErr w:type="spellStart"/>
-            <w:r>
-              <w:rPr>
-                <w:sz w:val="20"/>
-                <w:szCs w:val="20"/>
-              </w:rPr>
-              <w:t>hash</w:t>
-            </w:r>
-            <w:proofErr w:type="spellEnd"/>
-            <w:r>
-              <w:rPr>
-                <w:sz w:val="20"/>
-                <w:szCs w:val="20"/>
-              </w:rPr>
-              <w:t xml:space="preserve"> </w:t>
-            </w:r>
-            <w:proofErr w:type="spellStart"/>
-            <w:r>
-              <w:rPr>
-                <w:sz w:val="20"/>
-                <w:szCs w:val="20"/>
-              </w:rPr>
-              <w:t>BCrypt</w:t>
-            </w:r>
-            <w:proofErr w:type="spellEnd"/>
+              <w:t>Senhas só como hash BCrypt</w:t>
+            </w:r>
           </w:p>
         </w:tc>
         <w:tc>
@@ -9163,23 +7628,7 @@
                 <w:sz w:val="20"/>
                 <w:szCs w:val="20"/>
               </w:rPr>
-              <w:t xml:space="preserve">Parcial (atributo </w:t>
-            </w:r>
-            <w:proofErr w:type="spellStart"/>
-            <w:r>
-              <w:rPr>
-                <w:sz w:val="20"/>
-                <w:szCs w:val="20"/>
-              </w:rPr>
-              <w:t>Secure</w:t>
-            </w:r>
-            <w:proofErr w:type="spellEnd"/>
-            <w:r>
-              <w:rPr>
-                <w:sz w:val="20"/>
-                <w:szCs w:val="20"/>
-              </w:rPr>
-              <w:t xml:space="preserve"> não configurado)</w:t>
+              <w:t>Parcial (atributo Secure não configurado)</w:t>
             </w:r>
           </w:p>
         </w:tc>
@@ -9814,18 +8263,8 @@
                 <w:szCs w:val="20"/>
                 <w:lang w:val="en-US"/>
               </w:rPr>
-              <w:t xml:space="preserve">Java 21, Spring Boot 4.1.1, Spring Security e </w:t>
-            </w:r>
-            <w:proofErr w:type="spellStart"/>
-            <w:r>
-              <w:rPr>
-                <w:sz w:val="20"/>
-                <w:szCs w:val="20"/>
-                <w:lang w:val="en-US"/>
-              </w:rPr>
-              <w:t>Thymeleaf</w:t>
-            </w:r>
-            <w:proofErr w:type="spellEnd"/>
+              <w:t>Java 21, Spring Boot 4.1.1, Spring Security e Thymeleaf</w:t>
+            </w:r>
           </w:p>
         </w:tc>
         <w:tc>
@@ -9906,23 +8345,7 @@
                 <w:sz w:val="20"/>
                 <w:szCs w:val="20"/>
               </w:rPr>
-              <w:t xml:space="preserve">Usuários e sessões no </w:t>
-            </w:r>
-            <w:proofErr w:type="spellStart"/>
-            <w:r>
-              <w:rPr>
-                <w:sz w:val="20"/>
-                <w:szCs w:val="20"/>
-              </w:rPr>
-              <w:t>MongoDB</w:t>
-            </w:r>
-            <w:proofErr w:type="spellEnd"/>
-            <w:r>
-              <w:rPr>
-                <w:sz w:val="20"/>
-                <w:szCs w:val="20"/>
-              </w:rPr>
-              <w:t xml:space="preserve"> Atlas</w:t>
+              <w:t>Usuários e sessões no MongoDB Atlas</w:t>
             </w:r>
           </w:p>
         </w:tc>
@@ -10004,17 +8427,8 @@
                 <w:sz w:val="20"/>
                 <w:szCs w:val="20"/>
               </w:rPr>
-              <w:t xml:space="preserve">Repositório no GitHub com </w:t>
-            </w:r>
-            <w:proofErr w:type="spellStart"/>
-            <w:r>
-              <w:rPr>
-                <w:sz w:val="20"/>
-                <w:szCs w:val="20"/>
-              </w:rPr>
-              <w:t>GitFlow</w:t>
-            </w:r>
-            <w:proofErr w:type="spellEnd"/>
+              <w:t>Repositório no GitHub com GitFlow</w:t>
+            </w:r>
           </w:p>
         </w:tc>
         <w:tc>
@@ -10525,23 +8939,7 @@
                 <w:sz w:val="20"/>
                 <w:szCs w:val="20"/>
               </w:rPr>
-              <w:t xml:space="preserve">O nome deve ter de 2 a 100 caracteres e o e-mail deve ter formato válido, com até 254 caracteres. A validação acontece no servidor, mesmo quando o navegador também </w:t>
-            </w:r>
-            <w:proofErr w:type="spellStart"/>
-            <w:r>
-              <w:rPr>
-                <w:sz w:val="20"/>
-                <w:szCs w:val="20"/>
-              </w:rPr>
-              <w:t>valida</w:t>
-            </w:r>
-            <w:proofErr w:type="spellEnd"/>
-            <w:r>
-              <w:rPr>
-                <w:sz w:val="20"/>
-                <w:szCs w:val="20"/>
-              </w:rPr>
-              <w:t>.</w:t>
+              <w:t>O nome deve ter de 2 a 100 caracteres e o e-mail deve ter formato válido, com até 254 caracteres. A validação acontece no servidor, mesmo quando o navegador também valida.</w:t>
             </w:r>
           </w:p>
         </w:tc>
@@ -10623,23 +9021,7 @@
                 <w:sz w:val="20"/>
                 <w:szCs w:val="20"/>
               </w:rPr>
-              <w:t xml:space="preserve">A senha deve ter no mínimo 8 caracteres e no máximo 72 bytes em UTF-8, o limite do </w:t>
-            </w:r>
-            <w:proofErr w:type="spellStart"/>
-            <w:r>
-              <w:rPr>
-                <w:sz w:val="20"/>
-                <w:szCs w:val="20"/>
-              </w:rPr>
-              <w:t>BCrypt</w:t>
-            </w:r>
-            <w:proofErr w:type="spellEnd"/>
-            <w:r>
-              <w:rPr>
-                <w:sz w:val="20"/>
-                <w:szCs w:val="20"/>
-              </w:rPr>
-              <w:t>. Nesta versão não há campo de confirmação nem exigência de letra maiúscula, número ou símbolo.</w:t>
+              <w:t>A senha deve ter no mínimo 8 caracteres e no máximo 72 bytes em UTF-8, o limite do BCrypt. Nesta versão não há campo de confirmação nem exigência de letra maiúscula, número ou símbolo.</w:t>
             </w:r>
           </w:p>
         </w:tc>
@@ -10721,39 +9103,7 @@
                 <w:sz w:val="20"/>
                 <w:szCs w:val="20"/>
               </w:rPr>
-              <w:t xml:space="preserve">A senha é guardada só como </w:t>
-            </w:r>
-            <w:proofErr w:type="spellStart"/>
-            <w:r>
-              <w:rPr>
-                <w:sz w:val="20"/>
-                <w:szCs w:val="20"/>
-              </w:rPr>
-              <w:t>hash</w:t>
-            </w:r>
-            <w:proofErr w:type="spellEnd"/>
-            <w:r>
-              <w:rPr>
-                <w:sz w:val="20"/>
-                <w:szCs w:val="20"/>
-              </w:rPr>
-              <w:t xml:space="preserve"> </w:t>
-            </w:r>
-            <w:proofErr w:type="spellStart"/>
-            <w:r>
-              <w:rPr>
-                <w:sz w:val="20"/>
-                <w:szCs w:val="20"/>
-              </w:rPr>
-              <w:t>BCrypt</w:t>
-            </w:r>
-            <w:proofErr w:type="spellEnd"/>
-            <w:r>
-              <w:rPr>
-                <w:sz w:val="20"/>
-                <w:szCs w:val="20"/>
-              </w:rPr>
-              <w:t xml:space="preserve"> e nunca é exibida nas páginas nem devolvida pelo serviço.</w:t>
+              <w:t>A senha é guardada só como hash BCrypt e nunca é exibida nas páginas nem devolvida pelo serviço.</w:t>
             </w:r>
           </w:p>
         </w:tc>
@@ -10999,71 +9349,7 @@
                 <w:sz w:val="20"/>
                 <w:szCs w:val="20"/>
               </w:rPr>
-              <w:t xml:space="preserve">A sessão é gravada na coleção </w:t>
-            </w:r>
-            <w:proofErr w:type="spellStart"/>
-            <w:r>
-              <w:rPr>
-                <w:sz w:val="20"/>
-                <w:szCs w:val="20"/>
-              </w:rPr>
-              <w:t>sessoes</w:t>
-            </w:r>
-            <w:proofErr w:type="spellEnd"/>
-            <w:r>
-              <w:rPr>
-                <w:sz w:val="20"/>
-                <w:szCs w:val="20"/>
-              </w:rPr>
-              <w:t xml:space="preserve"> do Atlas e expira após 30 minutos sem atividade. O cookie SESSION usa </w:t>
-            </w:r>
-            <w:proofErr w:type="spellStart"/>
-            <w:r>
-              <w:rPr>
-                <w:sz w:val="20"/>
-                <w:szCs w:val="20"/>
-              </w:rPr>
-              <w:t>HttpOnly</w:t>
-            </w:r>
-            <w:proofErr w:type="spellEnd"/>
-            <w:r>
-              <w:rPr>
-                <w:sz w:val="20"/>
-                <w:szCs w:val="20"/>
-              </w:rPr>
-              <w:t xml:space="preserve"> e </w:t>
-            </w:r>
-            <w:proofErr w:type="spellStart"/>
-            <w:r>
-              <w:rPr>
-                <w:sz w:val="20"/>
-                <w:szCs w:val="20"/>
-              </w:rPr>
-              <w:t>SameSite</w:t>
-            </w:r>
-            <w:proofErr w:type="spellEnd"/>
-            <w:r>
-              <w:rPr>
-                <w:sz w:val="20"/>
-                <w:szCs w:val="20"/>
-              </w:rPr>
-              <w:t>=</w:t>
-            </w:r>
-            <w:proofErr w:type="spellStart"/>
-            <w:r>
-              <w:rPr>
-                <w:sz w:val="20"/>
-                <w:szCs w:val="20"/>
-              </w:rPr>
-              <w:t>Lax</w:t>
-            </w:r>
-            <w:proofErr w:type="spellEnd"/>
-            <w:r>
-              <w:rPr>
-                <w:sz w:val="20"/>
-                <w:szCs w:val="20"/>
-              </w:rPr>
-              <w:t>.</w:t>
+              <w:t>A sessão é gravada na coleção sessoes do Atlas e expira após 30 minutos sem atividade. O cookie SESSION usa HttpOnly e SameSite=Lax.</w:t>
             </w:r>
           </w:p>
         </w:tc>
@@ -11145,23 +9431,7 @@
                 <w:sz w:val="20"/>
                 <w:szCs w:val="20"/>
               </w:rPr>
-              <w:t>Todos os perfis são levados a /</w:t>
-            </w:r>
-            <w:proofErr w:type="spellStart"/>
-            <w:r>
-              <w:rPr>
-                <w:sz w:val="20"/>
-                <w:szCs w:val="20"/>
-              </w:rPr>
-              <w:t>inicio</w:t>
-            </w:r>
-            <w:proofErr w:type="spellEnd"/>
-            <w:r>
-              <w:rPr>
-                <w:sz w:val="20"/>
-                <w:szCs w:val="20"/>
-              </w:rPr>
-              <w:t>. O cabeçalho mostra só as opções permitidas ao perfil.</w:t>
+              <w:t>Todos os perfis são levados a /inicio. O cabeçalho mostra só as opções permitidas ao perfil.</w:t>
             </w:r>
           </w:p>
         </w:tc>
@@ -11464,39 +9734,7 @@
                 <w:sz w:val="20"/>
                 <w:szCs w:val="20"/>
               </w:rPr>
-              <w:t>São públicas /, /login, /cadastro, /</w:t>
-            </w:r>
-            <w:proofErr w:type="spellStart"/>
-            <w:r>
-              <w:rPr>
-                <w:sz w:val="20"/>
-                <w:szCs w:val="20"/>
-              </w:rPr>
-              <w:t>css</w:t>
-            </w:r>
-            <w:proofErr w:type="spellEnd"/>
-            <w:r>
-              <w:rPr>
-                <w:sz w:val="20"/>
-                <w:szCs w:val="20"/>
-              </w:rPr>
-              <w:t>/**, /imagens/** e /</w:t>
-            </w:r>
-            <w:proofErr w:type="spellStart"/>
-            <w:r>
-              <w:rPr>
-                <w:sz w:val="20"/>
-                <w:szCs w:val="20"/>
-              </w:rPr>
-              <w:t>error</w:t>
-            </w:r>
-            <w:proofErr w:type="spellEnd"/>
-            <w:r>
-              <w:rPr>
-                <w:sz w:val="20"/>
-                <w:szCs w:val="20"/>
-              </w:rPr>
-              <w:t xml:space="preserve"> (a rota / só redireciona para /inicio). /gerenciamento exige MANAGER ou ADMIN. /admin e /admin/** exigem ADMIN. Qualquer outra rota, incluindo /inicio, exige autenticação.</w:t>
+              <w:t>São públicas /, /login, /cadastro, /css/**, /imagens/** e /error (a rota / só redireciona para /inicio). /gerenciamento exige MANAGER ou ADMIN. /admin e /admin/** exigem ADMIN. Qualquer outra rota, incluindo /inicio, exige autenticação.</w:t>
             </w:r>
           </w:p>
         </w:tc>
@@ -11824,39 +10062,7 @@
                 <w:sz w:val="20"/>
                 <w:szCs w:val="20"/>
               </w:rPr>
-              <w:t xml:space="preserve">O nome do tema só pode ter letras minúsculas, números e hífen, validado na inicialização. O sistema carrega o arquivo de mesmo nome em </w:t>
-            </w:r>
-            <w:proofErr w:type="spellStart"/>
-            <w:r>
-              <w:rPr>
-                <w:sz w:val="20"/>
-                <w:szCs w:val="20"/>
-              </w:rPr>
-              <w:t>static</w:t>
-            </w:r>
-            <w:proofErr w:type="spellEnd"/>
-            <w:r>
-              <w:rPr>
-                <w:sz w:val="20"/>
-                <w:szCs w:val="20"/>
-              </w:rPr>
-              <w:t>/</w:t>
-            </w:r>
-            <w:proofErr w:type="spellStart"/>
-            <w:r>
-              <w:rPr>
-                <w:sz w:val="20"/>
-                <w:szCs w:val="20"/>
-              </w:rPr>
-              <w:t>css</w:t>
-            </w:r>
-            <w:proofErr w:type="spellEnd"/>
-            <w:r>
-              <w:rPr>
-                <w:sz w:val="20"/>
-                <w:szCs w:val="20"/>
-              </w:rPr>
-              <w:t>/temas e não confere se ele existe.</w:t>
+              <w:t>O nome do tema só pode ter letras minúsculas, números e hífen, validado na inicialização. O sistema carrega o arquivo de mesmo nome em static/css/temas e não confere se ele existe.</w:t>
             </w:r>
           </w:p>
         </w:tc>
@@ -12138,31 +10344,7 @@
         <w:jc w:val="both"/>
       </w:pPr>
       <w:r>
-        <w:t xml:space="preserve">O sistema entregue cumpre o que a atividade pede: cadastro, login e logout, senhas com </w:t>
-      </w:r>
-      <w:proofErr w:type="spellStart"/>
-      <w:r>
-        <w:t>hash</w:t>
-      </w:r>
-      <w:proofErr w:type="spellEnd"/>
-      <w:r>
-        <w:t xml:space="preserve"> </w:t>
-      </w:r>
-      <w:proofErr w:type="spellStart"/>
-      <w:r>
-        <w:t>BCrypt</w:t>
-      </w:r>
-      <w:proofErr w:type="spellEnd"/>
-      <w:r>
-        <w:t xml:space="preserve">, validação no servidor, três perfis com controle de acesso por rota, e usuários e sessões guardados no </w:t>
-      </w:r>
-      <w:proofErr w:type="spellStart"/>
-      <w:r>
-        <w:t>MongoDB</w:t>
-      </w:r>
-      <w:proofErr w:type="spellEnd"/>
-      <w:r>
-        <w:t xml:space="preserve"> Atlas. A divisão em camadas e a separação entre interface e regras permitem adaptar o projeto ao PFC mexendo na configuração, no CSS e nos fragmentos.</w:t>
+        <w:t>O sistema entregue cumpre o que a atividade pede: cadastro, login e logout, senhas com hash BCrypt, validação no servidor, três perfis com controle de acesso por rota, e usuários e sessões guardados no MongoDB Atlas. A divisão em camadas e a separação entre interface e regras permitem adaptar o projeto ao PFC mexendo na configuração, no CSS e nos fragmentos.</w:t>
       </w:r>
     </w:p>
     <w:p>
@@ -12172,113 +10354,6 @@
       </w:pPr>
       <w:r>
         <w:t>Para mim, foi útil escrever a primeira versão deste documento antes do código e depois compará-la com o que implementei. Algumas ideias do planejamento ficaram de fora, como a confirmação de senha e a desativação de contas. Outras surgiram durante o desenvolvimento, como a edição de usuários pelo administrador e o encerramento das sessões de quem é alterado ou excluído.</w:t>
-      </w:r>
-    </w:p>
-    <w:p>
-      <w:pPr>
-        <w:keepNext/>
-        <w:ind w:firstLine="709"/>
-        <w:jc w:val="both"/>
-      </w:pPr>
-      <w:r>
-        <w:t>Esta versão tem limitações que pretendo tratar nas próximas etapas:</w:t>
-      </w:r>
-    </w:p>
-    <w:p>
-      <w:pPr>
-        <w:ind w:left="1134" w:hanging="425"/>
-        <w:jc w:val="both"/>
-      </w:pPr>
-      <w:r>
-        <w:t>a) a senha exige só o mínimo de 8 caracteres, sem campo de confirmação nem exigência de letra maiúscula, número e símbolo;</w:t>
-      </w:r>
-    </w:p>
-    <w:p>
-      <w:pPr>
-        <w:ind w:left="1134" w:hanging="425"/>
-        <w:jc w:val="both"/>
-      </w:pPr>
-      <w:r>
-        <w:t>b) não existe uma página “Meu perfil” com nome, perfil e data de cadastro, e a entidade ainda não guarda a data de cadastro;</w:t>
-      </w:r>
-    </w:p>
-    <w:p>
-      <w:pPr>
-        <w:ind w:left="1134" w:hanging="425"/>
-        <w:jc w:val="both"/>
-      </w:pPr>
-      <w:r>
-        <w:t>c) a lista de usuários não tem busca nem paginação, o que vai pesar quando houver muitos registros;</w:t>
-      </w:r>
-    </w:p>
-    <w:p>
-      <w:pPr>
-        <w:ind w:left="1134" w:hanging="425"/>
-        <w:jc w:val="both"/>
-      </w:pPr>
-      <w:r>
-        <w:t>d) a exclusão é definitiva, sem opção de desativar uma conta e reativá-la depois;</w:t>
-      </w:r>
-    </w:p>
-    <w:p>
-      <w:pPr>
-        <w:ind w:left="1134" w:hanging="425"/>
-        <w:jc w:val="both"/>
-      </w:pPr>
-      <w:r>
-        <w:t>e) o sistema não confere se o arquivo CSS do tema configurado existe;</w:t>
-      </w:r>
-    </w:p>
-    <w:p>
-      <w:pPr>
-        <w:ind w:left="1134" w:hanging="425"/>
-        <w:jc w:val="both"/>
-      </w:pPr>
-      <w:r>
-        <w:t xml:space="preserve">f) as permissões foram testadas só manualmente, e faltam testes automatizados com </w:t>
-      </w:r>
-      <w:proofErr w:type="spellStart"/>
-      <w:r>
-        <w:t>MockMvc</w:t>
-      </w:r>
-      <w:proofErr w:type="spellEnd"/>
-      <w:r>
-        <w:t>;</w:t>
-      </w:r>
-    </w:p>
-    <w:p>
-      <w:pPr>
-        <w:ind w:left="1134" w:hanging="425"/>
-        <w:jc w:val="both"/>
-      </w:pPr>
-      <w:r>
-        <w:t xml:space="preserve">g) o atributo </w:t>
-      </w:r>
-      <w:proofErr w:type="spellStart"/>
-      <w:r>
-        <w:t>Secure</w:t>
-      </w:r>
-      <w:proofErr w:type="spellEnd"/>
-      <w:r>
-        <w:t xml:space="preserve"> do cookie não foi configurado, e a aplicação não foi testada publicada com HTTPS;</w:t>
-      </w:r>
-    </w:p>
-    <w:p>
-      <w:pPr>
-        <w:ind w:left="1134" w:hanging="425"/>
-        <w:jc w:val="both"/>
-      </w:pPr>
-      <w:r>
-        <w:t>h) a área de gerenciamento do perfil MANAGER ainda não tem funções próprias;</w:t>
-      </w:r>
-    </w:p>
-    <w:p>
-      <w:pPr>
-        <w:ind w:left="1134" w:hanging="425"/>
-        <w:jc w:val="both"/>
-      </w:pPr>
-      <w:r>
-        <w:t>i) o uso em telas estreitas não foi testado.</w:t>
       </w:r>
     </w:p>
     <w:p>
@@ -12299,23 +10374,7 @@
         <w:spacing w:after="240" w:line="240" w:lineRule="auto"/>
       </w:pPr>
       <w:r>
-        <w:t xml:space="preserve">MONGODB. </w:t>
-      </w:r>
-      <w:proofErr w:type="spellStart"/>
-      <w:r>
-        <w:t>MongoDB</w:t>
-      </w:r>
-      <w:proofErr w:type="spellEnd"/>
-      <w:r>
-        <w:t xml:space="preserve"> Atlas </w:t>
-      </w:r>
-      <w:proofErr w:type="spellStart"/>
-      <w:r>
-        <w:t>documentation</w:t>
-      </w:r>
-      <w:proofErr w:type="spellEnd"/>
-      <w:r>
-        <w:t>. 2026. Disponível em: https://www.mongodb.com/docs/atlas/. Acesso em: 8 out. 2026.</w:t>
+        <w:t>MONGODB. MongoDB Atlas documentation. 2026. Disponível em: https://www.mongodb.com/docs/atlas/. Acesso em: 8 out. 2026.</w:t>
       </w:r>
     </w:p>
     <w:p>
@@ -12365,88 +10424,18 @@
         <w:rPr>
           <w:lang w:val="en-US"/>
         </w:rPr>
-        <w:t xml:space="preserve">SPRING. Spring Security reference. 2026. </w:t>
-      </w:r>
-      <w:proofErr w:type="spellStart"/>
+        <w:t>SPRING. Spring Security reference. 2026. Disponível em: https://docs.spring.io/spring-security/reference/index.html. Acesso em: 8 out. 2026.</w:t>
+      </w:r>
+    </w:p>
+    <w:p>
+      <w:pPr>
+        <w:spacing w:after="240" w:line="240" w:lineRule="auto"/>
+      </w:pPr>
       <w:r>
         <w:rPr>
           <w:lang w:val="en-US"/>
         </w:rPr>
-        <w:t>Disponível</w:t>
-      </w:r>
-      <w:proofErr w:type="spellEnd"/>
-      <w:r>
-        <w:rPr>
-          <w:lang w:val="en-US"/>
-        </w:rPr>
-        <w:t xml:space="preserve"> </w:t>
-      </w:r>
-      <w:proofErr w:type="spellStart"/>
-      <w:r>
-        <w:rPr>
-          <w:lang w:val="en-US"/>
-        </w:rPr>
-        <w:t>em</w:t>
-      </w:r>
-      <w:proofErr w:type="spellEnd"/>
-      <w:r>
-        <w:rPr>
-          <w:lang w:val="en-US"/>
-        </w:rPr>
-        <w:t xml:space="preserve">: https://docs.spring.io/spring-security/reference/index.html. </w:t>
-      </w:r>
-      <w:proofErr w:type="spellStart"/>
-      <w:r>
-        <w:rPr>
-          <w:lang w:val="en-US"/>
-        </w:rPr>
-        <w:t>Acesso</w:t>
-      </w:r>
-      <w:proofErr w:type="spellEnd"/>
-      <w:r>
-        <w:rPr>
-          <w:lang w:val="en-US"/>
-        </w:rPr>
-        <w:t xml:space="preserve"> </w:t>
-      </w:r>
-      <w:proofErr w:type="spellStart"/>
-      <w:r>
-        <w:rPr>
-          <w:lang w:val="en-US"/>
-        </w:rPr>
-        <w:t>em</w:t>
-      </w:r>
-      <w:proofErr w:type="spellEnd"/>
-      <w:r>
-        <w:rPr>
-          <w:lang w:val="en-US"/>
-        </w:rPr>
-        <w:t>: 8 out. 2026.</w:t>
-      </w:r>
-    </w:p>
-    <w:p>
-      <w:pPr>
-        <w:spacing w:after="240" w:line="240" w:lineRule="auto"/>
-      </w:pPr>
-      <w:r>
-        <w:rPr>
-          <w:lang w:val="en-US"/>
-        </w:rPr>
-        <w:t xml:space="preserve">THYMELEAF. Tutorial: using </w:t>
-      </w:r>
-      <w:proofErr w:type="spellStart"/>
-      <w:r>
-        <w:rPr>
-          <w:lang w:val="en-US"/>
-        </w:rPr>
-        <w:t>Thymeleaf</w:t>
-      </w:r>
-      <w:proofErr w:type="spellEnd"/>
-      <w:r>
-        <w:rPr>
-          <w:lang w:val="en-US"/>
-        </w:rPr>
-        <w:t xml:space="preserve">. </w:t>
+        <w:t xml:space="preserve">THYMELEAF. Tutorial: using Thymeleaf. </w:t>
       </w:r>
       <w:r>
         <w:t>2026. Disponível em: https://www.thymeleaf.org/doc/tutorials/3.1/usingthymeleaf.html. Acesso em: 8 out. 2026.</w:t>

</xml_diff>